<commit_message>
Add AD DS docs and screenshots
Updated the raw AD DS documentation and added screenshots covering the completed OU structure and Windows Server activation troubleshooting steps.
</commit_message>
<xml_diff>
--- a/raw-notes/AD DS Documentation.docx
+++ b/raw-notes/AD DS Documentation.docx
@@ -423,7 +423,6 @@
     </w:p>
     <w:p>
       <w:r>
-        <w:lastRenderedPageBreak/>
         <w:t xml:space="preserve">Det gick sedan att fortsätta med wizarden och allt fungerade </w:t>
       </w:r>
       <w:r>
@@ -516,6 +515,11 @@
       </w:r>
     </w:p>
     <w:p>
+      <w:pPr>
+        <w:rPr>
+          <w:lang w:val="en-US"/>
+        </w:rPr>
+      </w:pPr>
       <w:r>
         <w:t xml:space="preserve">Efter inloggningen så såg jag till att </w:t>
       </w:r>
@@ -547,13 +551,69 @@
         <w:t>DC01.homelab.local</w:t>
       </w:r>
       <w:r>
-        <w:t xml:space="preserve">’. Så </w:t>
-      </w:r>
-      <w:r>
+        <w:t xml:space="preserve">’. </w:t>
+      </w:r>
+      <w:proofErr w:type="spellStart"/>
+      <w:r>
+        <w:rPr>
+          <w:lang w:val="en-US"/>
+        </w:rPr>
+        <w:t>Så</w:t>
+      </w:r>
+      <w:proofErr w:type="spellEnd"/>
+      <w:r>
+        <w:rPr>
+          <w:lang w:val="en-US"/>
+        </w:rPr>
+        <w:t xml:space="preserve"> </w:t>
+      </w:r>
+      <w:r>
+        <w:rPr>
+          <w:lang w:val="en-US"/>
+        </w:rPr>
         <w:t xml:space="preserve">jag </w:t>
       </w:r>
-      <w:r>
-        <w:t xml:space="preserve">använde oss av PowerShell kommandot: </w:t>
+      <w:proofErr w:type="spellStart"/>
+      <w:r>
+        <w:rPr>
+          <w:lang w:val="en-US"/>
+        </w:rPr>
+        <w:t>använde</w:t>
+      </w:r>
+      <w:proofErr w:type="spellEnd"/>
+      <w:r>
+        <w:rPr>
+          <w:lang w:val="en-US"/>
+        </w:rPr>
+        <w:t xml:space="preserve"> </w:t>
+      </w:r>
+      <w:proofErr w:type="spellStart"/>
+      <w:r>
+        <w:rPr>
+          <w:lang w:val="en-US"/>
+        </w:rPr>
+        <w:t>oss</w:t>
+      </w:r>
+      <w:proofErr w:type="spellEnd"/>
+      <w:r>
+        <w:rPr>
+          <w:lang w:val="en-US"/>
+        </w:rPr>
+        <w:t xml:space="preserve"> av PowerShell </w:t>
+      </w:r>
+      <w:proofErr w:type="spellStart"/>
+      <w:r>
+        <w:rPr>
+          <w:lang w:val="en-US"/>
+        </w:rPr>
+        <w:t>kommandot</w:t>
+      </w:r>
+      <w:proofErr w:type="spellEnd"/>
+      <w:r>
+        <w:rPr>
+          <w:lang w:val="en-US"/>
+        </w:rPr>
+        <w:t xml:space="preserve">: </w:t>
       </w:r>
     </w:p>
     <w:p>
@@ -564,9 +624,9 @@
           <w:iCs/>
           <w:sz w:val="20"/>
           <w:szCs w:val="20"/>
-        </w:rPr>
-      </w:pPr>
-      <w:proofErr w:type="spellStart"/>
+          <w:lang w:val="en-US"/>
+        </w:rPr>
+      </w:pPr>
       <w:r>
         <w:rPr>
           <w:i/>
@@ -574,10 +634,20 @@
           <w:color w:val="156082" w:themeColor="accent1"/>
           <w:sz w:val="20"/>
           <w:szCs w:val="20"/>
-        </w:rPr>
-        <w:t>Uninstall</w:t>
-      </w:r>
-      <w:proofErr w:type="spellEnd"/>
+          <w:lang w:val="en-US"/>
+        </w:rPr>
+        <w:t xml:space="preserve">Uninstall-ADDSDomainController </w:t>
+      </w:r>
+      <w:r>
+        <w:rPr>
+          <w:i/>
+          <w:iCs/>
+          <w:sz w:val="20"/>
+          <w:szCs w:val="20"/>
+          <w:lang w:val="en-US"/>
+        </w:rPr>
+        <w:t>-ForceRemoval -LocalAdministratorPassword (</w:t>
+      </w:r>
       <w:r>
         <w:rPr>
           <w:i/>
@@ -585,25 +655,7 @@
           <w:color w:val="156082" w:themeColor="accent1"/>
           <w:sz w:val="20"/>
           <w:szCs w:val="20"/>
-        </w:rPr>
-        <w:t xml:space="preserve">-ADDSDomainController </w:t>
-      </w:r>
-      <w:r>
-        <w:rPr>
-          <w:i/>
-          <w:iCs/>
-          <w:sz w:val="20"/>
-          <w:szCs w:val="20"/>
-        </w:rPr>
-        <w:t>-ForceRemoval -LocalAdministratorPassword (</w:t>
-      </w:r>
-      <w:r>
-        <w:rPr>
-          <w:i/>
-          <w:iCs/>
-          <w:color w:val="156082" w:themeColor="accent1"/>
-          <w:sz w:val="20"/>
-          <w:szCs w:val="20"/>
+          <w:lang w:val="en-US"/>
         </w:rPr>
         <w:t xml:space="preserve">ConvertTo-SecureString </w:t>
       </w:r>
@@ -614,6 +666,7 @@
           <w:color w:val="4EA72E" w:themeColor="accent6"/>
           <w:sz w:val="20"/>
           <w:szCs w:val="20"/>
+          <w:lang w:val="en-US"/>
         </w:rPr>
         <w:t xml:space="preserve">"YourNewLocalAdminPassword123!" </w:t>
       </w:r>
@@ -623,6 +676,7 @@
           <w:iCs/>
           <w:sz w:val="20"/>
           <w:szCs w:val="20"/>
+          <w:lang w:val="en-US"/>
         </w:rPr>
         <w:t>-AsPlainText -Force)</w:t>
       </w:r>
@@ -872,7 +926,6 @@
     <w:p/>
     <w:p>
       <w:r>
-        <w:lastRenderedPageBreak/>
         <w:t>Gjorde en clean ominstallation på AD DS</w:t>
       </w:r>
       <w:r>
@@ -1038,6 +1091,2140 @@
       <w:r>
         <w:t>Det var då klart för den dagen. Nästa tillfälle blir att sätta upp OUs.</w:t>
       </w:r>
+    </w:p>
+    <w:p/>
+    <w:p>
+      <w:pPr>
+        <w:pStyle w:val="Heading2"/>
+      </w:pPr>
+      <w:r>
+        <w:t>2026-08-31</w:t>
+      </w:r>
+    </w:p>
+    <w:p/>
+    <w:p>
+      <w:r>
+        <w:t xml:space="preserve">Startade från där jag slutade och skapade </w:t>
+      </w:r>
+      <w:proofErr w:type="gramStart"/>
+      <w:r>
+        <w:t>fyra stycken</w:t>
+      </w:r>
+      <w:proofErr w:type="gramEnd"/>
+      <w:r>
+        <w:t xml:space="preserve"> avdelningar som OUs, döpte dessa till: </w:t>
+      </w:r>
+      <w:r>
+        <w:rPr>
+          <w:b/>
+          <w:bCs/>
+          <w:i/>
+          <w:iCs/>
+        </w:rPr>
+        <w:t xml:space="preserve">Sales, HR, IT </w:t>
+      </w:r>
+      <w:r>
+        <w:t>och</w:t>
+      </w:r>
+      <w:r>
+        <w:t xml:space="preserve"> </w:t>
+      </w:r>
+      <w:r>
+        <w:rPr>
+          <w:b/>
+          <w:bCs/>
+          <w:i/>
+          <w:iCs/>
+        </w:rPr>
+        <w:t>Finance</w:t>
+      </w:r>
+      <w:r>
+        <w:t>. Lät dessa självklart ha ”</w:t>
+      </w:r>
+      <w:r>
+        <w:rPr>
+          <w:i/>
+          <w:iCs/>
+        </w:rPr>
+        <w:t>Protect from accidental deletion</w:t>
+      </w:r>
+      <w:r>
+        <w:t xml:space="preserve">” checkat. </w:t>
+      </w:r>
+    </w:p>
+    <w:p>
+      <w:r>
+        <w:t xml:space="preserve">Under tiden jag gjorde detta och läste på lite angående </w:t>
+      </w:r>
+      <w:r>
+        <w:t>OU:s</w:t>
+      </w:r>
+      <w:r>
+        <w:t xml:space="preserve"> på nätet så märkte jag av att min VM stängde av sig självt. </w:t>
+      </w:r>
+      <w:r>
+        <w:t>Tänkte inte mer på det, antog att det kunde varit en update eller liknande,</w:t>
+      </w:r>
+      <w:r>
+        <w:t xml:space="preserve"> så startade upp </w:t>
+      </w:r>
+      <w:r>
+        <w:t xml:space="preserve">min VM/server </w:t>
+      </w:r>
+      <w:r>
+        <w:t>den på nytt, tog screenshot av alla skapade OU avdelningar</w:t>
+      </w:r>
+      <w:r>
+        <w:t xml:space="preserve"> i ADUC fönstret.</w:t>
+      </w:r>
+      <w:r>
+        <w:t xml:space="preserve"> </w:t>
+      </w:r>
+      <w:r>
+        <w:t>L</w:t>
+      </w:r>
+      <w:r>
+        <w:t>ärde mi</w:t>
+      </w:r>
+      <w:r>
+        <w:t>g även</w:t>
+      </w:r>
+      <w:r>
+        <w:t xml:space="preserve"> hur jag skulle</w:t>
+      </w:r>
+      <w:r>
+        <w:t xml:space="preserve">, </w:t>
+      </w:r>
+      <w:r>
+        <w:t>om jag</w:t>
+      </w:r>
+      <w:r>
+        <w:t xml:space="preserve"> nu skulle</w:t>
+      </w:r>
+      <w:r>
+        <w:t xml:space="preserve"> vil</w:t>
+      </w:r>
+      <w:r>
+        <w:t>ja,</w:t>
+      </w:r>
+      <w:r>
+        <w:t xml:space="preserve"> kunna ta bort dessa </w:t>
+      </w:r>
+      <w:r>
+        <w:t>OU:s</w:t>
+      </w:r>
+      <w:r>
+        <w:t xml:space="preserve"> efter att ha lämnat ”</w:t>
+      </w:r>
+      <w:r>
+        <w:rPr>
+          <w:i/>
+          <w:iCs/>
+        </w:rPr>
+        <w:t>Protect from accidental deletion</w:t>
+      </w:r>
+      <w:r>
+        <w:rPr>
+          <w:i/>
+          <w:iCs/>
+        </w:rPr>
+        <w:t xml:space="preserve">” </w:t>
+      </w:r>
+      <w:r>
+        <w:t>checkat. Genom att gå, i ADUC fönstret:</w:t>
+      </w:r>
+    </w:p>
+    <w:p>
+      <w:pPr>
+        <w:pStyle w:val="ListParagraph"/>
+        <w:numPr>
+          <w:ilvl w:val="0"/>
+          <w:numId w:val="12"/>
+        </w:numPr>
+      </w:pPr>
+      <w:r>
+        <w:t xml:space="preserve"> View -&gt;</w:t>
+      </w:r>
+      <w:r>
+        <w:t xml:space="preserve"> </w:t>
+      </w:r>
+      <w:r>
+        <w:t>Klicka på ‘</w:t>
+      </w:r>
+      <w:r>
+        <w:rPr>
+          <w:i/>
+          <w:iCs/>
+        </w:rPr>
+        <w:t>Advanced Features</w:t>
+      </w:r>
+      <w:r>
+        <w:rPr>
+          <w:i/>
+          <w:iCs/>
+        </w:rPr>
+        <w:t xml:space="preserve">’ </w:t>
+      </w:r>
+    </w:p>
+    <w:p>
+      <w:pPr>
+        <w:pStyle w:val="ListParagraph"/>
+        <w:numPr>
+          <w:ilvl w:val="0"/>
+          <w:numId w:val="12"/>
+        </w:numPr>
+      </w:pPr>
+      <w:r>
+        <w:t>Högerklicka</w:t>
+      </w:r>
+      <w:r>
+        <w:t xml:space="preserve"> sedan</w:t>
+      </w:r>
+      <w:r>
+        <w:t xml:space="preserve"> på </w:t>
+      </w:r>
+      <w:proofErr w:type="spellStart"/>
+      <w:r>
+        <w:t>OUn</w:t>
+      </w:r>
+      <w:proofErr w:type="spellEnd"/>
+      <w:r>
+        <w:t xml:space="preserve"> som man v</w:t>
+      </w:r>
+      <w:r>
+        <w:t>ill ändra/ta bort</w:t>
+      </w:r>
+      <w:r>
+        <w:t xml:space="preserve"> i ADUC;</w:t>
+      </w:r>
+      <w:r>
+        <w:t xml:space="preserve"> exempelvis ’</w:t>
+      </w:r>
+      <w:r>
+        <w:rPr>
+          <w:i/>
+          <w:iCs/>
+          <w:u w:val="single"/>
+        </w:rPr>
+        <w:t>Sales</w:t>
+      </w:r>
+      <w:r>
+        <w:t xml:space="preserve">’ </w:t>
+      </w:r>
+      <w:r>
+        <w:t xml:space="preserve">-&gt; </w:t>
+      </w:r>
+      <w:r>
+        <w:rPr>
+          <w:i/>
+          <w:iCs/>
+        </w:rPr>
+        <w:t xml:space="preserve">properties </w:t>
+      </w:r>
+      <w:r>
+        <w:t xml:space="preserve">-&gt; </w:t>
+      </w:r>
+      <w:r>
+        <w:rPr>
+          <w:i/>
+          <w:iCs/>
+        </w:rPr>
+        <w:t xml:space="preserve">Object </w:t>
+      </w:r>
+    </w:p>
+    <w:p>
+      <w:pPr>
+        <w:pStyle w:val="ListParagraph"/>
+        <w:numPr>
+          <w:ilvl w:val="0"/>
+          <w:numId w:val="12"/>
+        </w:numPr>
+        <w:rPr>
+          <w:lang w:val="en-US"/>
+        </w:rPr>
+      </w:pPr>
+      <w:r>
+        <w:rPr>
+          <w:lang w:val="en-US"/>
+        </w:rPr>
+        <w:t>Avbocka ”</w:t>
+      </w:r>
+      <w:r>
+        <w:rPr>
+          <w:i/>
+          <w:iCs/>
+          <w:lang w:val="en-US"/>
+        </w:rPr>
+        <w:t>P</w:t>
+      </w:r>
+      <w:r>
+        <w:rPr>
+          <w:i/>
+          <w:iCs/>
+          <w:lang w:val="en-US"/>
+        </w:rPr>
+        <w:t>rotect object from accidental deletion</w:t>
+      </w:r>
+      <w:r>
+        <w:rPr>
+          <w:lang w:val="en-US"/>
+        </w:rPr>
+        <w:t>”</w:t>
+      </w:r>
+    </w:p>
+    <w:p>
+      <w:pPr>
+        <w:pStyle w:val="ListParagraph"/>
+        <w:numPr>
+          <w:ilvl w:val="0"/>
+          <w:numId w:val="12"/>
+        </w:numPr>
+        <w:rPr>
+          <w:lang w:val="en-US"/>
+        </w:rPr>
+      </w:pPr>
+      <w:r>
+        <w:rPr>
+          <w:lang w:val="en-US"/>
+        </w:rPr>
+        <w:t xml:space="preserve">Kan nu </w:t>
+      </w:r>
+      <w:proofErr w:type="spellStart"/>
+      <w:r>
+        <w:rPr>
+          <w:lang w:val="en-US"/>
+        </w:rPr>
+        <w:t>tas</w:t>
+      </w:r>
+      <w:proofErr w:type="spellEnd"/>
+      <w:r>
+        <w:rPr>
+          <w:lang w:val="en-US"/>
+        </w:rPr>
+        <w:t xml:space="preserve"> bort</w:t>
+      </w:r>
+    </w:p>
+    <w:p>
+      <w:r>
+        <w:t xml:space="preserve">Lämnade </w:t>
+      </w:r>
+      <w:r>
+        <w:t xml:space="preserve">check-boxen bockad för att skydda mig från att kunna ta bort dessa av misstag. Fortsatte till nästa steg  </w:t>
+      </w:r>
+      <w:r>
+        <w:t xml:space="preserve">där jag kollade upp </w:t>
+      </w:r>
+      <w:r>
+        <w:t>hur jag kunde skapa användare för avdelningarna</w:t>
+      </w:r>
+      <w:r>
+        <w:t xml:space="preserve">. Här kom nästa problem där min VM stängde av sig själv igen. Började felsöka med hjälp av Claude AI. </w:t>
+      </w:r>
+    </w:p>
+    <w:p>
+      <w:pPr>
+        <w:rPr>
+          <w:b/>
+          <w:bCs/>
+        </w:rPr>
+      </w:pPr>
+      <w:r>
+        <w:t xml:space="preserve">Kollade igenom Event Viewer för att leta reda på event id för avstängningar/omstarter. </w:t>
+      </w:r>
+      <w:r>
+        <w:t xml:space="preserve">Hittade </w:t>
+      </w:r>
+      <w:r>
+        <w:rPr>
+          <w:b/>
+          <w:bCs/>
+        </w:rPr>
+        <w:t>Event ID 1074</w:t>
+      </w:r>
+      <w:r>
+        <w:t xml:space="preserve">  </w:t>
+      </w:r>
+      <w:r>
+        <w:t xml:space="preserve">som stämde överens med </w:t>
+      </w:r>
+      <w:r>
+        <w:t>tiden som avstängningen skedde</w:t>
+      </w:r>
+      <w:r>
+        <w:rPr>
+          <w:b/>
+          <w:bCs/>
+        </w:rPr>
+        <w:t xml:space="preserve">: </w:t>
+      </w:r>
+    </w:p>
+    <w:p>
+      <w:pPr>
+        <w:pStyle w:val="Quote"/>
+        <w:rPr>
+          <w:b/>
+          <w:bCs/>
+          <w:color w:val="auto"/>
+          <w:lang w:val="en-US"/>
+        </w:rPr>
+      </w:pPr>
+      <w:r>
+        <w:rPr>
+          <w:color w:val="auto"/>
+          <w:lang w:val="en-US"/>
+        </w:rPr>
+        <w:t>The process C:\WINDOWS\system32\wlms\wlms.exe (DC01) has initiated the shutdown of computer DC01 on behalf of user NT AUTHORITY\SYSTEM for the following reason: Other (Planned) Reason Code: 0x80000000 Shutdown Type: shutdown"</w:t>
+      </w:r>
+    </w:p>
+    <w:p>
+      <w:r>
+        <w:br/>
+      </w:r>
+      <w:r>
+        <w:t>Detta betydde tydligen att jag i</w:t>
+      </w:r>
+      <w:r>
+        <w:t>nte aktiverat min ”trial” av Windows. Kontrollerade detta med kommandot: ’</w:t>
+      </w:r>
+      <w:proofErr w:type="spellStart"/>
+      <w:r>
+        <w:t>slmgr</w:t>
+      </w:r>
+      <w:proofErr w:type="spellEnd"/>
+      <w:r>
+        <w:t xml:space="preserve"> /dlv</w:t>
+      </w:r>
+      <w:r>
+        <w:t>’ i PowerShell, som öppnar e</w:t>
+      </w:r>
+      <w:r>
+        <w:t xml:space="preserve">n </w:t>
+      </w:r>
+      <w:proofErr w:type="spellStart"/>
+      <w:r>
+        <w:t>popupruta</w:t>
+      </w:r>
+      <w:proofErr w:type="spellEnd"/>
+      <w:r>
+        <w:t xml:space="preserve"> med licensinformation </w:t>
+      </w:r>
+      <w:r>
+        <w:t>i</w:t>
+      </w:r>
+      <w:r>
+        <w:t>. Fick inte fram någon ”</w:t>
+      </w:r>
+      <w:proofErr w:type="spellStart"/>
+      <w:r>
+        <w:t>Time</w:t>
+      </w:r>
+      <w:proofErr w:type="spellEnd"/>
+      <w:r>
+        <w:t xml:space="preserve"> </w:t>
+      </w:r>
+      <w:proofErr w:type="spellStart"/>
+      <w:r>
+        <w:t>remaining</w:t>
+      </w:r>
+      <w:proofErr w:type="spellEnd"/>
+      <w:r>
+        <w:t>” rad i information</w:t>
+      </w:r>
+      <w:r>
+        <w:t>en</w:t>
+      </w:r>
+      <w:r>
+        <w:t>, men såg att min licens var i</w:t>
+      </w:r>
+      <w:r>
+        <w:t>:</w:t>
+      </w:r>
+    </w:p>
+    <w:p>
+      <w:pPr>
+        <w:pStyle w:val="Quote"/>
+        <w:rPr>
+          <w:lang w:val="en-US"/>
+        </w:rPr>
+      </w:pPr>
+      <w:r>
+        <w:t xml:space="preserve"> </w:t>
+      </w:r>
+      <w:r>
+        <w:rPr>
+          <w:lang w:val="en-US"/>
+        </w:rPr>
+        <w:t>notification-</w:t>
+      </w:r>
+      <w:proofErr w:type="spellStart"/>
+      <w:r>
+        <w:rPr>
+          <w:lang w:val="en-US"/>
+        </w:rPr>
+        <w:t>läge</w:t>
+      </w:r>
+      <w:proofErr w:type="spellEnd"/>
+      <w:r>
+        <w:rPr>
+          <w:lang w:val="en-US"/>
+        </w:rPr>
+        <w:t xml:space="preserve"> och med </w:t>
+      </w:r>
+      <w:proofErr w:type="spellStart"/>
+      <w:r>
+        <w:rPr>
+          <w:lang w:val="en-US"/>
+        </w:rPr>
+        <w:t>anledningen</w:t>
+      </w:r>
+      <w:proofErr w:type="spellEnd"/>
+      <w:r>
+        <w:rPr>
+          <w:lang w:val="en-US"/>
+        </w:rPr>
+        <w:t>: ”Notification Reason: 0xC004F009 (grace time expired)</w:t>
+      </w:r>
+      <w:r>
+        <w:rPr>
+          <w:lang w:val="en-US"/>
+        </w:rPr>
+        <w:t>.</w:t>
+      </w:r>
+    </w:p>
+    <w:p>
+      <w:r>
+        <w:t xml:space="preserve">Problemet har framkommit för </w:t>
+      </w:r>
+      <w:r>
+        <w:t>att jag direkt vid skapandet av min VM ändrade till ett eget internt nätverk för min VM. Så hade aldrig fått</w:t>
+      </w:r>
+      <w:r>
+        <w:t xml:space="preserve"> min server i</w:t>
+      </w:r>
+      <w:r>
+        <w:t xml:space="preserve"> kontakt med internet, vilket gjorde att det inte </w:t>
+      </w:r>
+      <w:r>
+        <w:t>aktiverats</w:t>
+      </w:r>
+      <w:r>
+        <w:t>. Finns tydligen något ”</w:t>
+      </w:r>
+      <w:proofErr w:type="spellStart"/>
+      <w:r>
+        <w:t>failsafe</w:t>
+      </w:r>
+      <w:proofErr w:type="spellEnd"/>
+      <w:r>
+        <w:t xml:space="preserve">” att ifall man inte aktiverat inom någon tid så kommer servern stänga av sig </w:t>
+      </w:r>
+      <w:r>
+        <w:t xml:space="preserve">själv </w:t>
+      </w:r>
+      <w:r>
+        <w:t xml:space="preserve">efter ca 60 minuters </w:t>
+      </w:r>
+      <w:proofErr w:type="spellStart"/>
+      <w:r>
+        <w:t>runtime</w:t>
+      </w:r>
+      <w:proofErr w:type="spellEnd"/>
+      <w:r>
+        <w:t>, som påminnelse</w:t>
+      </w:r>
+      <w:r>
+        <w:t>. Fick därför</w:t>
+      </w:r>
+      <w:r>
+        <w:t xml:space="preserve"> stänga av min VM</w:t>
+      </w:r>
+      <w:r>
+        <w:t xml:space="preserve"> och ändra Network adapter till NAT så internet </w:t>
+      </w:r>
+      <w:proofErr w:type="spellStart"/>
+      <w:r>
+        <w:t>routas</w:t>
+      </w:r>
+      <w:proofErr w:type="spellEnd"/>
+      <w:r>
+        <w:t xml:space="preserve"> via host-datorn. Hade innan på Host-</w:t>
+      </w:r>
+      <w:proofErr w:type="spellStart"/>
+      <w:r>
+        <w:t>only</w:t>
+      </w:r>
+      <w:proofErr w:type="spellEnd"/>
+      <w:r>
+        <w:t xml:space="preserve">. Så testade att, i min </w:t>
+      </w:r>
+      <w:proofErr w:type="spellStart"/>
+      <w:r>
+        <w:t>guest</w:t>
+      </w:r>
+      <w:proofErr w:type="spellEnd"/>
+      <w:r>
+        <w:t xml:space="preserve"> (</w:t>
+      </w:r>
+      <w:proofErr w:type="spellStart"/>
+      <w:r>
+        <w:t>vm</w:t>
+      </w:r>
+      <w:proofErr w:type="spellEnd"/>
+      <w:r>
+        <w:t>), att ändra nätverks inställningar genom att öppna:</w:t>
+      </w:r>
+    </w:p>
+    <w:p>
+      <w:pPr>
+        <w:pStyle w:val="Quote"/>
+        <w:rPr>
+          <w:lang w:val="en-US"/>
+        </w:rPr>
+      </w:pPr>
+      <w:r>
+        <w:t xml:space="preserve"> </w:t>
+      </w:r>
+      <w:r>
+        <w:rPr>
+          <w:lang w:val="en-US"/>
+        </w:rPr>
+        <w:t xml:space="preserve">network connections -&gt; </w:t>
+      </w:r>
+      <w:proofErr w:type="spellStart"/>
+      <w:r>
+        <w:rPr>
+          <w:lang w:val="en-US"/>
+        </w:rPr>
+        <w:t>högerclicka</w:t>
+      </w:r>
+      <w:proofErr w:type="spellEnd"/>
+      <w:r>
+        <w:rPr>
+          <w:lang w:val="en-US"/>
+        </w:rPr>
+        <w:t xml:space="preserve"> min network adapter -&gt; properties -&gt; Internet protocol Version 4 (TCP/IPv4) -&gt; properties</w:t>
+      </w:r>
+    </w:p>
+    <w:p>
+      <w:r>
+        <w:t>ändrade från statiska adresser t</w:t>
+      </w:r>
+      <w:r>
+        <w:t xml:space="preserve">ill </w:t>
+      </w:r>
+      <w:r>
+        <w:t xml:space="preserve">att hitta IP och DNS server automatiskt. Löste inte problemet, testade med omstart. </w:t>
+      </w:r>
+      <w:r>
+        <w:t>Efter omstart så gick det fortfarande inte att få tag på internet för att aktivera min provperiod. Stängde</w:t>
+      </w:r>
+      <w:r>
+        <w:t xml:space="preserve"> då</w:t>
+      </w:r>
+      <w:r>
+        <w:t xml:space="preserve"> av min </w:t>
+      </w:r>
+      <w:proofErr w:type="spellStart"/>
+      <w:r>
+        <w:t>guest</w:t>
+      </w:r>
+      <w:proofErr w:type="spellEnd"/>
+      <w:r>
+        <w:t xml:space="preserve"> (</w:t>
+      </w:r>
+      <w:proofErr w:type="spellStart"/>
+      <w:r>
+        <w:t>vm</w:t>
+      </w:r>
+      <w:proofErr w:type="spellEnd"/>
+      <w:r>
+        <w:t>)</w:t>
+      </w:r>
+      <w:r>
+        <w:t xml:space="preserve"> på nytt och kollade i</w:t>
+      </w:r>
+      <w:r>
+        <w:t>:</w:t>
+      </w:r>
+    </w:p>
+    <w:p>
+      <w:pPr>
+        <w:pStyle w:val="Quote"/>
+        <w:rPr>
+          <w:lang w:val="en-US"/>
+        </w:rPr>
+      </w:pPr>
+      <w:r>
+        <w:t xml:space="preserve"> </w:t>
+      </w:r>
+      <w:r>
+        <w:rPr>
+          <w:lang w:val="en-US"/>
+        </w:rPr>
+        <w:t xml:space="preserve">VMware -&gt; Edit -&gt; Virtual </w:t>
+      </w:r>
+      <w:r>
+        <w:rPr>
+          <w:lang w:val="en-US"/>
+        </w:rPr>
+        <w:t>N</w:t>
+      </w:r>
+      <w:r>
+        <w:rPr>
+          <w:lang w:val="en-US"/>
+        </w:rPr>
+        <w:t>et</w:t>
+      </w:r>
+      <w:r>
+        <w:rPr>
+          <w:lang w:val="en-US"/>
+        </w:rPr>
+        <w:t xml:space="preserve">work Editor. </w:t>
+      </w:r>
+    </w:p>
+    <w:p>
+      <w:r>
+        <w:t>Såg att det fortfarande var kopplat till Host-</w:t>
+      </w:r>
+      <w:proofErr w:type="spellStart"/>
+      <w:r>
+        <w:t>only</w:t>
+      </w:r>
+      <w:proofErr w:type="spellEnd"/>
+      <w:r>
+        <w:t xml:space="preserve"> där samt att det var det enda nätverket tillgängligt. Klickade på ’Change </w:t>
+      </w:r>
+      <w:proofErr w:type="spellStart"/>
+      <w:r>
+        <w:t>Settings</w:t>
+      </w:r>
+      <w:proofErr w:type="spellEnd"/>
+      <w:r>
+        <w:t xml:space="preserve">’ och la till ett nytt nätverk och klickade i NAT på det nya nätverket. Gick sedan in på: </w:t>
+      </w:r>
+    </w:p>
+    <w:p>
+      <w:r>
+        <w:t xml:space="preserve">VM -&gt; </w:t>
+      </w:r>
+      <w:proofErr w:type="spellStart"/>
+      <w:r>
+        <w:t>Settings</w:t>
+      </w:r>
+      <w:proofErr w:type="spellEnd"/>
+      <w:r>
+        <w:t xml:space="preserve"> -&gt; Network Adapter och valde det nya nätverket nu, vilket i mitt fall blev ’VMnet01’. Startade upp </w:t>
+      </w:r>
+      <w:proofErr w:type="spellStart"/>
+      <w:r>
+        <w:t>guest</w:t>
+      </w:r>
+      <w:proofErr w:type="spellEnd"/>
+      <w:r>
+        <w:t xml:space="preserve"> och loggade in. Kollade att internet var korrekt med: </w:t>
+      </w:r>
+    </w:p>
+    <w:p>
+      <w:pPr>
+        <w:pStyle w:val="IntenseQuote"/>
+      </w:pPr>
+      <w:proofErr w:type="spellStart"/>
+      <w:r>
+        <w:t>ipconfig</w:t>
+      </w:r>
+      <w:proofErr w:type="spellEnd"/>
+      <w:r>
+        <w:t xml:space="preserve"> /all </w:t>
+      </w:r>
+    </w:p>
+    <w:p>
+      <w:r>
+        <w:t xml:space="preserve">i PowerShell. Dubbelkollade även med: </w:t>
+      </w:r>
+    </w:p>
+    <w:p>
+      <w:pPr>
+        <w:pStyle w:val="IntenseQuote"/>
+      </w:pPr>
+      <w:r>
+        <w:t>Test-</w:t>
+      </w:r>
+      <w:proofErr w:type="spellStart"/>
+      <w:r>
+        <w:t>NetConnection</w:t>
+      </w:r>
+      <w:proofErr w:type="spellEnd"/>
+      <w:r>
+        <w:t xml:space="preserve"> google.com</w:t>
+      </w:r>
+    </w:p>
+    <w:p>
+      <w:r>
+        <w:t>Tvingade sedan Windows att aktivera m</w:t>
+      </w:r>
+      <w:r>
+        <w:t>in licens online med:</w:t>
+      </w:r>
+    </w:p>
+    <w:p>
+      <w:pPr>
+        <w:pStyle w:val="IntenseQuote"/>
+      </w:pPr>
+      <w:proofErr w:type="spellStart"/>
+      <w:r>
+        <w:t>slmgr</w:t>
+      </w:r>
+      <w:proofErr w:type="spellEnd"/>
+      <w:r>
+        <w:t xml:space="preserve"> /</w:t>
+      </w:r>
+      <w:proofErr w:type="spellStart"/>
+      <w:r>
+        <w:t>ato</w:t>
+      </w:r>
+      <w:proofErr w:type="spellEnd"/>
+    </w:p>
+    <w:p>
+      <w:r>
+        <w:t>Efter lyckad aktivering, dubbelkollade jag att det stämde med:</w:t>
+      </w:r>
+    </w:p>
+    <w:p>
+      <w:pPr>
+        <w:pStyle w:val="IntenseQuote"/>
+      </w:pPr>
+      <w:proofErr w:type="spellStart"/>
+      <w:r>
+        <w:t>slmgr</w:t>
+      </w:r>
+      <w:proofErr w:type="spellEnd"/>
+      <w:r>
+        <w:t xml:space="preserve"> /</w:t>
+      </w:r>
+      <w:proofErr w:type="spellStart"/>
+      <w:r>
+        <w:t>xpr</w:t>
+      </w:r>
+      <w:proofErr w:type="spellEnd"/>
+    </w:p>
+    <w:p>
+      <w:r>
+        <w:t xml:space="preserve">Nu har jag ca 180 dagar av trial-period för min server aktiverat och redo. Efter allt detta var jag tvungen att stänga ner min </w:t>
+      </w:r>
+      <w:proofErr w:type="spellStart"/>
+      <w:r>
+        <w:t>guest</w:t>
+      </w:r>
+      <w:proofErr w:type="spellEnd"/>
+      <w:r>
+        <w:t xml:space="preserve"> för att fixa nätverket tillbaka till host-</w:t>
+      </w:r>
+      <w:proofErr w:type="spellStart"/>
+      <w:r>
+        <w:t>only</w:t>
+      </w:r>
+      <w:proofErr w:type="spellEnd"/>
+      <w:r>
+        <w:t xml:space="preserve">. </w:t>
+      </w:r>
+    </w:p>
+    <w:p>
+      <w:pPr>
+        <w:pStyle w:val="Quote"/>
+      </w:pPr>
+      <w:r>
+        <w:t xml:space="preserve">VM → </w:t>
+      </w:r>
+      <w:proofErr w:type="spellStart"/>
+      <w:r>
+        <w:t>Settings</w:t>
+      </w:r>
+      <w:proofErr w:type="spellEnd"/>
+      <w:r>
+        <w:t xml:space="preserve"> → Network Adapter</w:t>
+      </w:r>
+      <w:r>
+        <w:t xml:space="preserve"> </w:t>
+      </w:r>
+    </w:p>
+    <w:p>
+      <w:r>
+        <w:t xml:space="preserve">Efter det blev det att start upp </w:t>
+      </w:r>
+      <w:proofErr w:type="spellStart"/>
+      <w:r>
+        <w:t>guest</w:t>
+      </w:r>
+      <w:proofErr w:type="spellEnd"/>
+      <w:r>
+        <w:t xml:space="preserve"> igen och ändra tillbaka till de fasta adresser jag hade innan:</w:t>
+      </w:r>
+    </w:p>
+    <w:p>
+      <w:pPr>
+        <w:pStyle w:val="Quote"/>
+      </w:pPr>
+      <w:r>
+        <w:t xml:space="preserve"> Internet Protocol Version 4 (TCP/IP) -&gt; Properties </w:t>
+      </w:r>
+    </w:p>
+    <w:p>
+      <w:r>
+        <w:t>Kollade att allt var tillbaka och min domain var som den skulle med PowerShell-kommandona:</w:t>
+      </w:r>
+    </w:p>
+    <w:p>
+      <w:pPr>
+        <w:pStyle w:val="IntenseQuote"/>
+      </w:pPr>
+      <w:r>
+        <w:t>Get-</w:t>
+      </w:r>
+      <w:proofErr w:type="spellStart"/>
+      <w:r>
+        <w:t>ADDomain</w:t>
+      </w:r>
+      <w:proofErr w:type="spellEnd"/>
+    </w:p>
+    <w:p>
+      <w:r>
+        <w:t>O</w:t>
+      </w:r>
+      <w:r>
+        <w:t>ch</w:t>
+      </w:r>
+      <w:r>
+        <w:t xml:space="preserve"> eftersom vi rörde DN</w:t>
+      </w:r>
+      <w:r>
+        <w:t>S inställningar så kollar vi att DC01 kan lösa sin egen DNS server:</w:t>
+      </w:r>
+    </w:p>
+    <w:p>
+      <w:pPr>
+        <w:pStyle w:val="IntenseQuote"/>
+      </w:pPr>
+      <w:r>
+        <w:t xml:space="preserve"> </w:t>
+      </w:r>
+      <w:r>
+        <w:t>Resolve-</w:t>
+      </w:r>
+      <w:proofErr w:type="spellStart"/>
+      <w:r>
+        <w:t>DnsName</w:t>
+      </w:r>
+      <w:proofErr w:type="spellEnd"/>
+      <w:r>
+        <w:t xml:space="preserve"> </w:t>
+      </w:r>
+      <w:proofErr w:type="spellStart"/>
+      <w:r>
+        <w:t>homelab.local</w:t>
+      </w:r>
+      <w:proofErr w:type="spellEnd"/>
+    </w:p>
+    <w:p>
+      <w:r>
+        <w:t xml:space="preserve">Fick fram två A </w:t>
+      </w:r>
+      <w:proofErr w:type="spellStart"/>
+      <w:r>
+        <w:t>records</w:t>
+      </w:r>
+      <w:proofErr w:type="spellEnd"/>
+      <w:r>
+        <w:t xml:space="preserve"> för </w:t>
+      </w:r>
+      <w:proofErr w:type="spellStart"/>
+      <w:r>
+        <w:rPr>
+          <w:b/>
+          <w:bCs/>
+          <w:u w:val="single"/>
+        </w:rPr>
+        <w:t>homelab.local</w:t>
+      </w:r>
+      <w:proofErr w:type="spellEnd"/>
+      <w:r>
+        <w:rPr>
+          <w:b/>
+          <w:bCs/>
+        </w:rPr>
+        <w:t xml:space="preserve">. </w:t>
+      </w:r>
+      <w:r>
+        <w:t xml:space="preserve">Ena är den vi vill ha: </w:t>
+      </w:r>
+      <w:r>
+        <w:rPr>
+          <w:i/>
+          <w:iCs/>
+        </w:rPr>
+        <w:t>192.168.50.10</w:t>
+      </w:r>
+      <w:r>
+        <w:t xml:space="preserve">  </w:t>
+      </w:r>
+      <w:r>
+        <w:t xml:space="preserve">och den andra är något kvarglömd från vårt stök innan: </w:t>
+      </w:r>
+      <w:r>
+        <w:rPr>
+          <w:i/>
+          <w:iCs/>
+        </w:rPr>
+        <w:t>192.168.187.128</w:t>
+      </w:r>
+      <w:r>
+        <w:rPr>
+          <w:i/>
+          <w:iCs/>
+        </w:rPr>
+        <w:t>.</w:t>
+      </w:r>
+      <w:r>
+        <w:t xml:space="preserve"> Fick därför gå in och ta bort den manuellt. </w:t>
+      </w:r>
+    </w:p>
+    <w:p>
+      <w:pPr>
+        <w:pStyle w:val="ListParagraph"/>
+        <w:numPr>
+          <w:ilvl w:val="0"/>
+          <w:numId w:val="13"/>
+        </w:numPr>
+      </w:pPr>
+      <w:r>
+        <w:t>Server Manager -&gt; Tools -&gt; DNS</w:t>
+      </w:r>
+    </w:p>
+    <w:p>
+      <w:pPr>
+        <w:pStyle w:val="ListParagraph"/>
+        <w:numPr>
+          <w:ilvl w:val="0"/>
+          <w:numId w:val="13"/>
+        </w:numPr>
+        <w:rPr>
+          <w:lang w:val="en-US"/>
+        </w:rPr>
+      </w:pPr>
+      <w:r>
+        <w:rPr>
+          <w:lang w:val="en-US"/>
+        </w:rPr>
+        <w:t xml:space="preserve">DC01 -&gt; Forward Lookup Zones -&gt; </w:t>
+      </w:r>
+      <w:proofErr w:type="spellStart"/>
+      <w:r>
+        <w:rPr>
+          <w:lang w:val="en-US"/>
+        </w:rPr>
+        <w:t>homelab.</w:t>
+      </w:r>
+      <w:r>
+        <w:rPr>
+          <w:lang w:val="en-US"/>
+        </w:rPr>
+        <w:t>local</w:t>
+      </w:r>
+      <w:proofErr w:type="spellEnd"/>
+    </w:p>
+    <w:p>
+      <w:pPr>
+        <w:pStyle w:val="ListParagraph"/>
+        <w:numPr>
+          <w:ilvl w:val="0"/>
+          <w:numId w:val="13"/>
+        </w:numPr>
+      </w:pPr>
+      <w:r>
+        <w:t xml:space="preserve">Hitta </w:t>
+      </w:r>
+      <w:r>
+        <w:rPr>
+          <w:i/>
+          <w:iCs/>
+        </w:rPr>
+        <w:t xml:space="preserve">(Same as </w:t>
+      </w:r>
+      <w:proofErr w:type="spellStart"/>
+      <w:r>
+        <w:rPr>
+          <w:i/>
+          <w:iCs/>
+        </w:rPr>
+        <w:t>parent</w:t>
+      </w:r>
+      <w:proofErr w:type="spellEnd"/>
+      <w:r>
+        <w:rPr>
+          <w:i/>
+          <w:iCs/>
+        </w:rPr>
+        <w:t xml:space="preserve"> folder)</w:t>
+      </w:r>
+      <w:r>
+        <w:t xml:space="preserve"> med </w:t>
+      </w:r>
+      <w:r>
+        <w:t xml:space="preserve">Data </w:t>
+      </w:r>
+      <w:r>
+        <w:rPr>
+          <w:i/>
+          <w:iCs/>
+        </w:rPr>
+        <w:t>192.168.187.128</w:t>
+      </w:r>
+    </w:p>
+    <w:p>
+      <w:pPr>
+        <w:pStyle w:val="ListParagraph"/>
+        <w:numPr>
+          <w:ilvl w:val="0"/>
+          <w:numId w:val="13"/>
+        </w:numPr>
+      </w:pPr>
+      <w:r>
+        <w:t xml:space="preserve">Högerklicka och </w:t>
+      </w:r>
+      <w:proofErr w:type="spellStart"/>
+      <w:r>
+        <w:rPr>
+          <w:i/>
+          <w:iCs/>
+        </w:rPr>
+        <w:t>Delete</w:t>
+      </w:r>
+      <w:proofErr w:type="spellEnd"/>
+    </w:p>
+    <w:p>
+      <w:r>
+        <w:t>Kolla att det nu stämmer med samma PowerShell kommando som tidigare</w:t>
+      </w:r>
+    </w:p>
+    <w:p>
+      <w:pPr>
+        <w:pStyle w:val="IntenseQuote"/>
+      </w:pPr>
+      <w:r>
+        <w:t>Resolve-</w:t>
+      </w:r>
+      <w:proofErr w:type="spellStart"/>
+      <w:r>
+        <w:t>DnsName</w:t>
+      </w:r>
+      <w:proofErr w:type="spellEnd"/>
+      <w:r>
+        <w:t xml:space="preserve"> </w:t>
+      </w:r>
+      <w:proofErr w:type="spellStart"/>
+      <w:r>
+        <w:t>homelab.local</w:t>
+      </w:r>
+      <w:proofErr w:type="spellEnd"/>
+    </w:p>
+    <w:p>
+      <w:r>
+        <w:t xml:space="preserve">Ser nu endast en </w:t>
+      </w:r>
+      <w:proofErr w:type="spellStart"/>
+      <w:r>
+        <w:t>entry</w:t>
+      </w:r>
+      <w:proofErr w:type="spellEnd"/>
+      <w:r>
+        <w:t xml:space="preserve"> f</w:t>
+      </w:r>
+      <w:r>
+        <w:t xml:space="preserve">ör </w:t>
+      </w:r>
+      <w:r>
+        <w:rPr>
+          <w:i/>
+          <w:iCs/>
+        </w:rPr>
+        <w:t>192.168.50.10</w:t>
+      </w:r>
+      <w:r>
+        <w:rPr>
+          <w:i/>
+          <w:iCs/>
+        </w:rPr>
+        <w:t xml:space="preserve">. </w:t>
+      </w:r>
+      <w:r>
+        <w:t>Nu tillbaka till det som ska göras: Skapa användare och grupper.</w:t>
+      </w:r>
+    </w:p>
+    <w:p/>
+    <w:p>
+      <w:pPr>
+        <w:pStyle w:val="Heading2"/>
+      </w:pPr>
+      <w:r>
+        <w:t>2026-09-07</w:t>
+      </w:r>
+    </w:p>
+    <w:p/>
+    <w:p>
+      <w:r>
+        <w:t xml:space="preserve">Skapade en ny user i Sales-OU. Döptes till </w:t>
+      </w:r>
+      <w:r>
+        <w:rPr>
+          <w:i/>
+          <w:iCs/>
+          <w:u w:val="single"/>
+        </w:rPr>
+        <w:t>Anna Andersson</w:t>
+      </w:r>
+      <w:r>
+        <w:t xml:space="preserve">. Satte till att användaren var tvungen att byta lösenord vid nästa log-in för ’best </w:t>
+      </w:r>
+      <w:proofErr w:type="spellStart"/>
+      <w:r>
+        <w:t>practice</w:t>
+      </w:r>
+      <w:proofErr w:type="spellEnd"/>
+      <w:r>
+        <w:t xml:space="preserve">’. </w:t>
+      </w:r>
+    </w:p>
+    <w:p>
+      <w:pPr>
+        <w:pStyle w:val="Heading2"/>
+      </w:pPr>
+      <w:r>
+        <w:t>2026-09-08</w:t>
+      </w:r>
+    </w:p>
+    <w:p/>
+    <w:p>
+      <w:r>
+        <w:t>Skapade en ’Security group’ för Sales med namn</w:t>
+      </w:r>
+      <w:r>
+        <w:t xml:space="preserve">et: </w:t>
+      </w:r>
+      <w:r>
+        <w:rPr>
+          <w:b/>
+          <w:bCs/>
+        </w:rPr>
+        <w:t>SG-Sales</w:t>
+      </w:r>
+      <w:r>
+        <w:t xml:space="preserve">. </w:t>
+      </w:r>
+      <w:r>
+        <w:t xml:space="preserve">Kommer </w:t>
+      </w:r>
+      <w:r>
+        <w:t xml:space="preserve">nog </w:t>
+      </w:r>
+      <w:r>
+        <w:t>döpa samtliga Security Groups med</w:t>
+      </w:r>
+      <w:r>
+        <w:t xml:space="preserve"> </w:t>
+      </w:r>
+      <w:r>
+        <w:t>’</w:t>
+      </w:r>
+      <w:r>
+        <w:rPr>
+          <w:b/>
+          <w:bCs/>
+        </w:rPr>
+        <w:t>SG-</w:t>
+      </w:r>
+      <w:r>
+        <w:rPr>
+          <w:b/>
+          <w:bCs/>
+          <w:i/>
+          <w:iCs/>
+        </w:rPr>
+        <w:t>[branch]</w:t>
+      </w:r>
+      <w:r>
+        <w:t>’</w:t>
+      </w:r>
+      <w:r>
+        <w:t xml:space="preserve"> framöver för att göra det enklare att hålla koll på. </w:t>
+      </w:r>
+      <w:r>
+        <w:rPr>
+          <w:b/>
+          <w:bCs/>
+        </w:rPr>
+        <w:t>SG-</w:t>
+      </w:r>
+      <w:r>
+        <w:rPr>
+          <w:b/>
+          <w:bCs/>
+        </w:rPr>
+        <w:t>S</w:t>
+      </w:r>
+      <w:r>
+        <w:rPr>
+          <w:b/>
+          <w:bCs/>
+        </w:rPr>
+        <w:t>ales</w:t>
+      </w:r>
+      <w:r>
+        <w:t xml:space="preserve"> skapades även inne i Sales OU, detta för att göra det lättare att ha allt organiserat</w:t>
+      </w:r>
+      <w:r>
+        <w:t xml:space="preserve"> och enklare</w:t>
+      </w:r>
+      <w:r>
+        <w:t>.</w:t>
+      </w:r>
+      <w:r>
+        <w:t xml:space="preserve"> Gjorde detta via </w:t>
+      </w:r>
+      <w:proofErr w:type="spellStart"/>
+      <w:r>
+        <w:t>GUI:n</w:t>
+      </w:r>
+      <w:proofErr w:type="spellEnd"/>
+      <w:r>
+        <w:t xml:space="preserve">. Nästa branch blir nog att försöka få på plats via PowerShell-script. </w:t>
+      </w:r>
+      <w:r>
+        <w:br/>
+        <w:t xml:space="preserve">Placerade ”Anna Andersson” I </w:t>
+      </w:r>
+      <w:r>
+        <w:rPr>
+          <w:b/>
+          <w:bCs/>
+        </w:rPr>
+        <w:t>SG-Sales</w:t>
+      </w:r>
+      <w:r>
+        <w:t xml:space="preserve"> genom ’</w:t>
+      </w:r>
+      <w:r>
+        <w:rPr>
+          <w:i/>
+          <w:iCs/>
+        </w:rPr>
+        <w:t xml:space="preserve">SG-Sales -&gt; properties -&gt; </w:t>
+      </w:r>
+      <w:proofErr w:type="spellStart"/>
+      <w:r>
+        <w:rPr>
+          <w:i/>
+          <w:iCs/>
+        </w:rPr>
+        <w:t>Members</w:t>
+      </w:r>
+      <w:proofErr w:type="spellEnd"/>
+      <w:r>
+        <w:rPr>
+          <w:i/>
+          <w:iCs/>
+        </w:rPr>
+        <w:t xml:space="preserve"> -&gt; </w:t>
+      </w:r>
+      <w:proofErr w:type="spellStart"/>
+      <w:r>
+        <w:rPr>
+          <w:i/>
+          <w:iCs/>
+        </w:rPr>
+        <w:t>add</w:t>
+      </w:r>
+      <w:proofErr w:type="spellEnd"/>
+      <w:r>
+        <w:t>’</w:t>
+      </w:r>
+    </w:p>
+    <w:p/>
+    <w:p>
+      <w:r>
+        <w:t>Försökte lära mig hur PowerShell hanterar skapandet av nya OU-</w:t>
+      </w:r>
+      <w:proofErr w:type="spellStart"/>
+      <w:r>
+        <w:t>users</w:t>
+      </w:r>
+      <w:proofErr w:type="spellEnd"/>
+      <w:r>
+        <w:t xml:space="preserve"> med exempel via kommandot:</w:t>
+      </w:r>
+    </w:p>
+    <w:p>
+      <w:pPr>
+        <w:pStyle w:val="IntenseQuote"/>
+      </w:pPr>
+      <w:r>
+        <w:t>Get-Help New-</w:t>
+      </w:r>
+      <w:proofErr w:type="spellStart"/>
+      <w:r>
+        <w:t>ADUser</w:t>
+      </w:r>
+      <w:proofErr w:type="spellEnd"/>
+      <w:r>
+        <w:t xml:space="preserve"> -</w:t>
+      </w:r>
+      <w:proofErr w:type="spellStart"/>
+      <w:r>
+        <w:t>Examples</w:t>
+      </w:r>
+      <w:proofErr w:type="spellEnd"/>
+    </w:p>
+    <w:p>
+      <w:r>
+        <w:t xml:space="preserve">Tyvärr får jag fram att Get-Help inte kan hitta ’Help’ filerna och behöver laddas ner, vilket blir ett problem då jag bytt tillbaka till Lokalt nätverk. Tydligen så skeppas inte Windows med help filerna per default så man måste ladda ner dem efter installation om man vill kunna </w:t>
+      </w:r>
+      <w:r>
+        <w:t>använda</w:t>
+      </w:r>
+      <w:r>
+        <w:t xml:space="preserve"> Get-Help-kommandot.</w:t>
+      </w:r>
+      <w:r>
+        <w:t xml:space="preserve"> </w:t>
+      </w:r>
+    </w:p>
+    <w:p>
+      <w:r>
+        <w:t xml:space="preserve">Med det sagt: Orkar inte gå ut och ändra nätverket till NAT igen för att ladda ner detta för tillfället. Så </w:t>
+      </w:r>
+      <w:r>
+        <w:t>G</w:t>
+      </w:r>
+      <w:r>
+        <w:t xml:space="preserve">oogle/Claude får bli min hjälp </w:t>
+      </w:r>
+      <w:r>
+        <w:t>i stället</w:t>
+      </w:r>
+      <w:r>
+        <w:t xml:space="preserve"> just nu</w:t>
+      </w:r>
+      <w:r>
+        <w:t>.</w:t>
+      </w:r>
+      <w:r>
+        <w:t xml:space="preserve"> Fick tips av Claude att en annat kommando som komplettering:</w:t>
+      </w:r>
+    </w:p>
+    <w:p>
+      <w:pPr>
+        <w:pStyle w:val="IntenseQuote"/>
+      </w:pPr>
+      <w:r>
+        <w:lastRenderedPageBreak/>
+        <w:t>Get-</w:t>
+      </w:r>
+      <w:proofErr w:type="spellStart"/>
+      <w:r>
+        <w:t>Command</w:t>
+      </w:r>
+      <w:proofErr w:type="spellEnd"/>
+      <w:r>
+        <w:t xml:space="preserve"> New-</w:t>
+      </w:r>
+      <w:proofErr w:type="spellStart"/>
+      <w:r>
+        <w:t>ADUser</w:t>
+      </w:r>
+      <w:proofErr w:type="spellEnd"/>
+      <w:r>
+        <w:t xml:space="preserve"> -Syntax</w:t>
+      </w:r>
+    </w:p>
+    <w:p>
+      <w:r>
+        <w:t>Detta ger mig samtliga parametrar som kan följa New-</w:t>
+      </w:r>
+      <w:proofErr w:type="spellStart"/>
+      <w:r>
+        <w:t>ADUser</w:t>
+      </w:r>
+      <w:proofErr w:type="spellEnd"/>
+      <w:r>
+        <w:t xml:space="preserve">, några som jag känner igen från </w:t>
+      </w:r>
+      <w:proofErr w:type="spellStart"/>
+      <w:r>
+        <w:t>GUI:n</w:t>
+      </w:r>
+      <w:proofErr w:type="spellEnd"/>
+      <w:r>
+        <w:t xml:space="preserve">. </w:t>
+      </w:r>
+      <w:r>
+        <w:t>Nu</w:t>
+      </w:r>
+      <w:r>
+        <w:t xml:space="preserve"> ska jag försöka </w:t>
+      </w:r>
+      <w:r>
+        <w:t>skriva ett kommando för att skapa en ’New-</w:t>
+      </w:r>
+      <w:proofErr w:type="spellStart"/>
+      <w:r>
+        <w:t>ADUser</w:t>
+      </w:r>
+      <w:proofErr w:type="spellEnd"/>
+      <w:r>
+        <w:t xml:space="preserve">’ med hjälp av parameter listan. </w:t>
+      </w:r>
+      <w:r>
+        <w:t xml:space="preserve">Efter lite googlande så kom jag fram till detta kommando: </w:t>
+      </w:r>
+    </w:p>
+    <w:p>
+      <w:pPr>
+        <w:pStyle w:val="IntenseQuote"/>
+        <w:rPr>
+          <w:lang w:val="en-US"/>
+        </w:rPr>
+      </w:pPr>
+      <w:r>
+        <w:rPr>
+          <w:lang w:val="en-US"/>
+        </w:rPr>
+        <w:t>New-</w:t>
+      </w:r>
+      <w:proofErr w:type="spellStart"/>
+      <w:r>
+        <w:rPr>
+          <w:lang w:val="en-US"/>
+        </w:rPr>
+        <w:t>ADUser</w:t>
+      </w:r>
+      <w:proofErr w:type="spellEnd"/>
+      <w:r>
+        <w:rPr>
+          <w:lang w:val="en-US"/>
+        </w:rPr>
+        <w:t xml:space="preserve"> -Name "Bengt Karlsson" -Path "OU=IT,DC=</w:t>
+      </w:r>
+      <w:proofErr w:type="spellStart"/>
+      <w:r>
+        <w:rPr>
+          <w:lang w:val="en-US"/>
+        </w:rPr>
+        <w:t>homelab.local</w:t>
+      </w:r>
+      <w:proofErr w:type="spellEnd"/>
+      <w:r>
+        <w:rPr>
+          <w:lang w:val="en-US"/>
+        </w:rPr>
+        <w:t>" -</w:t>
+      </w:r>
+      <w:proofErr w:type="spellStart"/>
+      <w:r>
+        <w:rPr>
+          <w:lang w:val="en-US"/>
+        </w:rPr>
+        <w:t>GivenName</w:t>
+      </w:r>
+      <w:proofErr w:type="spellEnd"/>
+      <w:r>
+        <w:rPr>
+          <w:lang w:val="en-US"/>
+        </w:rPr>
+        <w:t xml:space="preserve"> "Bengt" -Surname "Karlsson" -</w:t>
+      </w:r>
+      <w:proofErr w:type="spellStart"/>
+      <w:r>
+        <w:rPr>
+          <w:lang w:val="en-US"/>
+        </w:rPr>
+        <w:t>SamAccountName</w:t>
+      </w:r>
+      <w:proofErr w:type="spellEnd"/>
+      <w:r>
+        <w:rPr>
+          <w:lang w:val="en-US"/>
+        </w:rPr>
+        <w:t xml:space="preserve"> "</w:t>
+      </w:r>
+      <w:proofErr w:type="spellStart"/>
+      <w:r>
+        <w:rPr>
+          <w:lang w:val="en-US"/>
+        </w:rPr>
+        <w:t>BengtKarlsson</w:t>
+      </w:r>
+      <w:proofErr w:type="spellEnd"/>
+      <w:r>
+        <w:rPr>
+          <w:lang w:val="en-US"/>
+        </w:rPr>
+        <w:t>" -</w:t>
+      </w:r>
+      <w:proofErr w:type="spellStart"/>
+      <w:r>
+        <w:rPr>
+          <w:lang w:val="en-US"/>
+        </w:rPr>
+        <w:t>UserPrinicalName</w:t>
+      </w:r>
+      <w:proofErr w:type="spellEnd"/>
+      <w:r>
+        <w:rPr>
+          <w:lang w:val="en-US"/>
+        </w:rPr>
+        <w:t xml:space="preserve"> "</w:t>
+      </w:r>
+      <w:proofErr w:type="spellStart"/>
+      <w:r>
+        <w:rPr>
+          <w:lang w:val="en-US"/>
+        </w:rPr>
+        <w:t>bengtkarlsson@homelab.local</w:t>
+      </w:r>
+      <w:proofErr w:type="spellEnd"/>
+      <w:r>
+        <w:rPr>
+          <w:lang w:val="en-US"/>
+        </w:rPr>
+        <w:t>" -</w:t>
+      </w:r>
+      <w:proofErr w:type="spellStart"/>
+      <w:r>
+        <w:rPr>
+          <w:lang w:val="en-US"/>
+        </w:rPr>
+        <w:t>AccountPassword</w:t>
+      </w:r>
+      <w:proofErr w:type="spellEnd"/>
+      <w:r>
+        <w:rPr>
+          <w:lang w:val="en-US"/>
+        </w:rPr>
+        <w:t xml:space="preserve"> (ConvertTo-SecureString "Qwerty123!" -AsPlainText -Force) -</w:t>
+      </w:r>
+      <w:proofErr w:type="spellStart"/>
+      <w:r>
+        <w:rPr>
+          <w:lang w:val="en-US"/>
+        </w:rPr>
+        <w:t>ChangePasswordAtLogon</w:t>
+      </w:r>
+      <w:proofErr w:type="spellEnd"/>
+      <w:r>
+        <w:rPr>
+          <w:lang w:val="en-US"/>
+        </w:rPr>
+        <w:t xml:space="preserve"> $True -DisplayName "Bengt Karlsson" -Enabled $True</w:t>
+      </w:r>
+    </w:p>
+    <w:p>
+      <w:r>
+        <w:t>Detta gav mig ett e</w:t>
+      </w:r>
+      <w:r>
+        <w:t>rror på grund av att jag stavat fel på ’-</w:t>
+      </w:r>
+      <w:proofErr w:type="spellStart"/>
+      <w:r>
+        <w:t>UserPrincipalName</w:t>
+      </w:r>
+      <w:proofErr w:type="spellEnd"/>
+      <w:r>
+        <w:t>’. Insåg inte detta först så jag tog bort ’-</w:t>
+      </w:r>
+      <w:proofErr w:type="spellStart"/>
+      <w:r>
+        <w:t>UserPrincipalName</w:t>
+      </w:r>
+      <w:proofErr w:type="spellEnd"/>
+      <w:r>
+        <w:t>’ helt och försökte på nytt:</w:t>
+      </w:r>
+    </w:p>
+    <w:p>
+      <w:pPr>
+        <w:pStyle w:val="IntenseQuote"/>
+        <w:rPr>
+          <w:lang w:val="en-US"/>
+        </w:rPr>
+      </w:pPr>
+      <w:r>
+        <w:rPr>
+          <w:lang w:val="en-US"/>
+        </w:rPr>
+        <w:t>New-</w:t>
+      </w:r>
+      <w:proofErr w:type="spellStart"/>
+      <w:r>
+        <w:rPr>
+          <w:lang w:val="en-US"/>
+        </w:rPr>
+        <w:t>ADUser</w:t>
+      </w:r>
+      <w:proofErr w:type="spellEnd"/>
+      <w:r>
+        <w:rPr>
+          <w:lang w:val="en-US"/>
+        </w:rPr>
+        <w:t xml:space="preserve"> -Name "Bengt Karlsson" -Path "OU=IT,DC=</w:t>
+      </w:r>
+      <w:proofErr w:type="spellStart"/>
+      <w:r>
+        <w:rPr>
+          <w:lang w:val="en-US"/>
+        </w:rPr>
+        <w:t>homelab.local</w:t>
+      </w:r>
+      <w:proofErr w:type="spellEnd"/>
+      <w:r>
+        <w:rPr>
+          <w:lang w:val="en-US"/>
+        </w:rPr>
+        <w:t>" -</w:t>
+      </w:r>
+      <w:proofErr w:type="spellStart"/>
+      <w:r>
+        <w:rPr>
+          <w:lang w:val="en-US"/>
+        </w:rPr>
+        <w:t>GivenName</w:t>
+      </w:r>
+      <w:proofErr w:type="spellEnd"/>
+      <w:r>
+        <w:rPr>
+          <w:lang w:val="en-US"/>
+        </w:rPr>
+        <w:t xml:space="preserve"> "Bengt" -Surname "Karlsson" -</w:t>
+      </w:r>
+      <w:proofErr w:type="spellStart"/>
+      <w:r>
+        <w:rPr>
+          <w:lang w:val="en-US"/>
+        </w:rPr>
+        <w:t>SamAccountName</w:t>
+      </w:r>
+      <w:proofErr w:type="spellEnd"/>
+      <w:r>
+        <w:rPr>
+          <w:lang w:val="en-US"/>
+        </w:rPr>
+        <w:t xml:space="preserve"> "</w:t>
+      </w:r>
+      <w:proofErr w:type="spellStart"/>
+      <w:r>
+        <w:rPr>
+          <w:lang w:val="en-US"/>
+        </w:rPr>
+        <w:t>BengtKarlsson</w:t>
+      </w:r>
+      <w:proofErr w:type="spellEnd"/>
+      <w:r>
+        <w:rPr>
+          <w:lang w:val="en-US"/>
+        </w:rPr>
+        <w:t>" -</w:t>
+      </w:r>
+      <w:proofErr w:type="spellStart"/>
+      <w:r>
+        <w:rPr>
+          <w:lang w:val="en-US"/>
+        </w:rPr>
+        <w:t>AccountPassword</w:t>
+      </w:r>
+      <w:proofErr w:type="spellEnd"/>
+      <w:r>
+        <w:rPr>
+          <w:lang w:val="en-US"/>
+        </w:rPr>
+        <w:t xml:space="preserve"> (ConvertTo-SecureString "Qwerty123!" -AsPlainText -Force) -</w:t>
+      </w:r>
+      <w:proofErr w:type="spellStart"/>
+      <w:r>
+        <w:rPr>
+          <w:lang w:val="en-US"/>
+        </w:rPr>
+        <w:t>ChangePasswordAtLogon</w:t>
+      </w:r>
+      <w:proofErr w:type="spellEnd"/>
+      <w:r>
+        <w:rPr>
+          <w:lang w:val="en-US"/>
+        </w:rPr>
+        <w:t xml:space="preserve"> $True -DisplayName "Bengt Karlsson" -Enabled $True</w:t>
+      </w:r>
+    </w:p>
+    <w:p>
+      <w:r>
+        <w:t xml:space="preserve">Fick error här på </w:t>
+      </w:r>
+      <w:r>
+        <w:t>’</w:t>
+      </w:r>
+      <w:r>
+        <w:t>-</w:t>
+      </w:r>
+      <w:proofErr w:type="spellStart"/>
+      <w:r>
+        <w:t>Path</w:t>
+      </w:r>
+      <w:proofErr w:type="spellEnd"/>
+      <w:r>
+        <w:t>’, detta var för att jag inte delat upp ’</w:t>
+      </w:r>
+      <w:proofErr w:type="spellStart"/>
+      <w:r>
+        <w:t>homelab.local</w:t>
+      </w:r>
+      <w:proofErr w:type="spellEnd"/>
+      <w:r>
+        <w:t xml:space="preserve">’, det ska tydligen delas upp i stil med var allting ligger, i vilken ordning. Såsom: </w:t>
+      </w:r>
+    </w:p>
+    <w:p>
+      <w:pPr>
+        <w:pStyle w:val="IntenseQuote"/>
+      </w:pPr>
+      <w:r>
+        <w:t>-</w:t>
+      </w:r>
+      <w:proofErr w:type="spellStart"/>
+      <w:r>
+        <w:t>Path</w:t>
+      </w:r>
+      <w:proofErr w:type="spellEnd"/>
+      <w:r>
+        <w:t xml:space="preserve"> ”OU=IT,DC=homelab,DC=</w:t>
+      </w:r>
+      <w:proofErr w:type="spellStart"/>
+      <w:r>
+        <w:t>local</w:t>
+      </w:r>
+      <w:proofErr w:type="spellEnd"/>
+      <w:r>
+        <w:t>”</w:t>
+      </w:r>
+    </w:p>
+    <w:p>
+      <w:r>
+        <w:t xml:space="preserve">Detta berättar nu att </w:t>
+      </w:r>
+      <w:proofErr w:type="spellStart"/>
+      <w:r>
+        <w:t>OU:n</w:t>
+      </w:r>
+      <w:proofErr w:type="spellEnd"/>
+      <w:r>
+        <w:t xml:space="preserve"> IT ligger i </w:t>
+      </w:r>
+      <w:proofErr w:type="spellStart"/>
+      <w:r>
+        <w:t>homelab</w:t>
+      </w:r>
+      <w:proofErr w:type="spellEnd"/>
+      <w:r>
+        <w:t xml:space="preserve"> som ligger i </w:t>
+      </w:r>
+      <w:proofErr w:type="spellStart"/>
+      <w:r>
+        <w:t>local</w:t>
+      </w:r>
+      <w:proofErr w:type="spellEnd"/>
+      <w:r>
+        <w:t>.</w:t>
+      </w:r>
+    </w:p>
+    <w:p>
+      <w:r>
+        <w:t>Hela New-</w:t>
+      </w:r>
+      <w:proofErr w:type="spellStart"/>
+      <w:r>
+        <w:t>ADUser</w:t>
+      </w:r>
+      <w:proofErr w:type="spellEnd"/>
+      <w:r>
+        <w:t xml:space="preserve"> kommandot som fungerade:</w:t>
+      </w:r>
+    </w:p>
+    <w:p>
+      <w:pPr>
+        <w:pStyle w:val="IntenseQuote"/>
+        <w:rPr>
+          <w:lang w:val="en-US"/>
+        </w:rPr>
+      </w:pPr>
+      <w:r>
+        <w:rPr>
+          <w:lang w:val="en-US"/>
+        </w:rPr>
+        <w:t>New-</w:t>
+      </w:r>
+      <w:proofErr w:type="spellStart"/>
+      <w:r>
+        <w:rPr>
+          <w:lang w:val="en-US"/>
+        </w:rPr>
+        <w:t>ADUser</w:t>
+      </w:r>
+      <w:proofErr w:type="spellEnd"/>
+      <w:r>
+        <w:rPr>
+          <w:lang w:val="en-US"/>
+        </w:rPr>
+        <w:t xml:space="preserve"> -Name "Bengt Karlsson" -Path "OU=IT,DC=homelab,DC=local" -</w:t>
+      </w:r>
+      <w:proofErr w:type="spellStart"/>
+      <w:r>
+        <w:rPr>
+          <w:lang w:val="en-US"/>
+        </w:rPr>
+        <w:t>GivenName</w:t>
+      </w:r>
+      <w:proofErr w:type="spellEnd"/>
+      <w:r>
+        <w:rPr>
+          <w:lang w:val="en-US"/>
+        </w:rPr>
+        <w:t xml:space="preserve"> "Bengt" -Surname "Karlsson" -</w:t>
+      </w:r>
+      <w:proofErr w:type="spellStart"/>
+      <w:r>
+        <w:rPr>
+          <w:lang w:val="en-US"/>
+        </w:rPr>
+        <w:t>SamAccountName</w:t>
+      </w:r>
+      <w:proofErr w:type="spellEnd"/>
+      <w:r>
+        <w:rPr>
+          <w:lang w:val="en-US"/>
+        </w:rPr>
+        <w:t xml:space="preserve"> "</w:t>
+      </w:r>
+      <w:proofErr w:type="spellStart"/>
+      <w:r>
+        <w:rPr>
+          <w:lang w:val="en-US"/>
+        </w:rPr>
+        <w:t>BengtKarlsson</w:t>
+      </w:r>
+      <w:proofErr w:type="spellEnd"/>
+      <w:r>
+        <w:rPr>
+          <w:lang w:val="en-US"/>
+        </w:rPr>
+        <w:t>" -</w:t>
+      </w:r>
+      <w:proofErr w:type="spellStart"/>
+      <w:r>
+        <w:rPr>
+          <w:lang w:val="en-US"/>
+        </w:rPr>
+        <w:t>AccountPassword</w:t>
+      </w:r>
+      <w:proofErr w:type="spellEnd"/>
+      <w:r>
+        <w:rPr>
+          <w:lang w:val="en-US"/>
+        </w:rPr>
+        <w:t xml:space="preserve"> (ConvertTo-SecureString "Qwerty123!" -AsPlainText -Force) -</w:t>
+      </w:r>
+      <w:proofErr w:type="spellStart"/>
+      <w:r>
+        <w:rPr>
+          <w:lang w:val="en-US"/>
+        </w:rPr>
+        <w:t>ChangePasswordAtLogon</w:t>
+      </w:r>
+      <w:proofErr w:type="spellEnd"/>
+      <w:r>
+        <w:rPr>
+          <w:lang w:val="en-US"/>
+        </w:rPr>
+        <w:t xml:space="preserve"> $True -DisplayName "Bengt Karlsson" -Enabled $True</w:t>
+      </w:r>
+    </w:p>
+    <w:p>
+      <w:r>
+        <w:t xml:space="preserve">Detta skapade </w:t>
+      </w:r>
+      <w:proofErr w:type="spellStart"/>
+      <w:r>
+        <w:t>Usern</w:t>
+      </w:r>
+      <w:proofErr w:type="spellEnd"/>
+      <w:r>
+        <w:t xml:space="preserve"> “Bengt </w:t>
+      </w:r>
+      <w:r>
+        <w:t>K</w:t>
+      </w:r>
+      <w:r>
+        <w:t>a</w:t>
+      </w:r>
+      <w:r>
+        <w:t>rlsson” men ingen satt</w:t>
+      </w:r>
+      <w:r>
+        <w:t xml:space="preserve"> ’-</w:t>
+      </w:r>
+      <w:proofErr w:type="spellStart"/>
+      <w:r>
+        <w:t>UserPrincipalName</w:t>
+      </w:r>
+      <w:proofErr w:type="spellEnd"/>
+      <w:r>
+        <w:t>’. Insåg att jag endast hade stavat fel och försökte, och lyckades, lösa detta med ’Set-</w:t>
+      </w:r>
+      <w:proofErr w:type="spellStart"/>
+      <w:r>
+        <w:t>ADUser</w:t>
+      </w:r>
+      <w:proofErr w:type="spellEnd"/>
+      <w:r>
+        <w:t>’ kommandot:</w:t>
+      </w:r>
+    </w:p>
+    <w:p>
+      <w:pPr>
+        <w:pStyle w:val="IntenseQuote"/>
+        <w:rPr>
+          <w:lang w:val="en-US"/>
+        </w:rPr>
+      </w:pPr>
+      <w:r>
+        <w:rPr>
+          <w:lang w:val="en-US"/>
+        </w:rPr>
+        <w:t>Set-</w:t>
+      </w:r>
+      <w:proofErr w:type="spellStart"/>
+      <w:r>
+        <w:rPr>
+          <w:lang w:val="en-US"/>
+        </w:rPr>
+        <w:t>ADUser</w:t>
+      </w:r>
+      <w:proofErr w:type="spellEnd"/>
+      <w:r>
+        <w:rPr>
+          <w:lang w:val="en-US"/>
+        </w:rPr>
+        <w:t xml:space="preserve"> -Identity "</w:t>
+      </w:r>
+      <w:proofErr w:type="spellStart"/>
+      <w:r>
+        <w:rPr>
+          <w:lang w:val="en-US"/>
+        </w:rPr>
+        <w:t>BengtKarlsson</w:t>
+      </w:r>
+      <w:proofErr w:type="spellEnd"/>
+      <w:r>
+        <w:rPr>
+          <w:lang w:val="en-US"/>
+        </w:rPr>
+        <w:t>" -</w:t>
+      </w:r>
+      <w:proofErr w:type="spellStart"/>
+      <w:r>
+        <w:rPr>
+          <w:lang w:val="en-US"/>
+        </w:rPr>
+        <w:t>UserPrincipalName</w:t>
+      </w:r>
+      <w:proofErr w:type="spellEnd"/>
+      <w:r>
+        <w:rPr>
+          <w:lang w:val="en-US"/>
+        </w:rPr>
+        <w:t xml:space="preserve"> </w:t>
+      </w:r>
+      <w:r>
+        <w:rPr>
+          <w:lang w:val="en-US"/>
+        </w:rPr>
+        <w:t>“</w:t>
+      </w:r>
+      <w:proofErr w:type="spellStart"/>
+      <w:r>
+        <w:rPr>
+          <w:lang w:val="en-US"/>
+        </w:rPr>
+        <w:t>bengt.karlsson@homelab.local</w:t>
+      </w:r>
+      <w:proofErr w:type="spellEnd"/>
+      <w:r>
+        <w:rPr>
+          <w:lang w:val="en-US"/>
+        </w:rPr>
+        <w:t>”</w:t>
+      </w:r>
+    </w:p>
+    <w:p>
+      <w:pPr>
+        <w:rPr>
+          <w:lang w:val="en-US"/>
+        </w:rPr>
+      </w:pPr>
+    </w:p>
+    <w:p>
+      <w:pPr>
+        <w:rPr>
+          <w:lang w:val="en-US"/>
+        </w:rPr>
+      </w:pPr>
+    </w:p>
+    <w:p>
+      <w:pPr>
+        <w:jc w:val="center"/>
+        <w:rPr>
+          <w:rStyle w:val="Emphasis"/>
+        </w:rPr>
+      </w:pPr>
+      <w:r>
+        <w:rPr>
+          <w:rStyle w:val="IntenseEmphasis"/>
+          <w:u w:val="single"/>
+        </w:rPr>
+        <w:t>TODO</w:t>
+      </w:r>
+      <w:r>
+        <w:rPr>
+          <w:rStyle w:val="IntenseEmphasis"/>
+          <w:u w:val="single"/>
+        </w:rPr>
+        <w:t>:</w:t>
+      </w:r>
+      <w:r>
+        <w:rPr>
+          <w:rStyle w:val="IntenseEmphasis"/>
+        </w:rPr>
+        <w:t xml:space="preserve"> </w:t>
+      </w:r>
+      <w:r>
+        <w:rPr>
+          <w:rStyle w:val="Emphasis"/>
+        </w:rPr>
+        <w:t>Skapa Security Group för IT, göra samma process för HR och Finance</w:t>
+      </w:r>
+    </w:p>
+    <w:p>
+      <w:pPr>
+        <w:rPr>
+          <w:rStyle w:val="Emphasis"/>
+          <w:i w:val="0"/>
+          <w:iCs w:val="0"/>
+        </w:rPr>
+      </w:pPr>
     </w:p>
     <w:sectPr>
       <w:pgSz w:w="11906" w:h="16838"/>
@@ -1261,6 +3448,185 @@
       <w:rPr>
         <w:rFonts w:ascii="Wingdings" w:hAnsi="Wingdings" w:hint="default"/>
       </w:rPr>
+    </w:lvl>
+  </w:abstractNum>
+  <w:abstractNum w:abstractNumId="2" w15:restartNumberingAfterBreak="0">
+    <w:nsid w:val="65EF5964"/>
+    <w:multiLevelType w:val="hybridMultilevel"/>
+    <w:tmpl w:val="33B8660C"/>
+    <w:lvl w:ilvl="0" w:tplc="2000000F">
+      <w:start w:val="1"/>
+      <w:numFmt w:val="decimal"/>
+      <w:lvlText w:val="%1."/>
+      <w:lvlJc w:val="left"/>
+      <w:pPr>
+        <w:ind w:left="720" w:hanging="360"/>
+      </w:pPr>
+      <w:rPr>
+        <w:rFonts w:hint="default"/>
+      </w:rPr>
+    </w:lvl>
+    <w:lvl w:ilvl="1" w:tplc="20000019" w:tentative="1">
+      <w:start w:val="1"/>
+      <w:numFmt w:val="lowerLetter"/>
+      <w:lvlText w:val="%2."/>
+      <w:lvlJc w:val="left"/>
+      <w:pPr>
+        <w:ind w:left="1440" w:hanging="360"/>
+      </w:pPr>
+    </w:lvl>
+    <w:lvl w:ilvl="2" w:tplc="2000001B" w:tentative="1">
+      <w:start w:val="1"/>
+      <w:numFmt w:val="lowerRoman"/>
+      <w:lvlText w:val="%3."/>
+      <w:lvlJc w:val="right"/>
+      <w:pPr>
+        <w:ind w:left="2160" w:hanging="180"/>
+      </w:pPr>
+    </w:lvl>
+    <w:lvl w:ilvl="3" w:tplc="2000000F" w:tentative="1">
+      <w:start w:val="1"/>
+      <w:numFmt w:val="decimal"/>
+      <w:lvlText w:val="%4."/>
+      <w:lvlJc w:val="left"/>
+      <w:pPr>
+        <w:ind w:left="2880" w:hanging="360"/>
+      </w:pPr>
+    </w:lvl>
+    <w:lvl w:ilvl="4" w:tplc="20000019" w:tentative="1">
+      <w:start w:val="1"/>
+      <w:numFmt w:val="lowerLetter"/>
+      <w:lvlText w:val="%5."/>
+      <w:lvlJc w:val="left"/>
+      <w:pPr>
+        <w:ind w:left="3600" w:hanging="360"/>
+      </w:pPr>
+    </w:lvl>
+    <w:lvl w:ilvl="5" w:tplc="2000001B" w:tentative="1">
+      <w:start w:val="1"/>
+      <w:numFmt w:val="lowerRoman"/>
+      <w:lvlText w:val="%6."/>
+      <w:lvlJc w:val="right"/>
+      <w:pPr>
+        <w:ind w:left="4320" w:hanging="180"/>
+      </w:pPr>
+    </w:lvl>
+    <w:lvl w:ilvl="6" w:tplc="2000000F" w:tentative="1">
+      <w:start w:val="1"/>
+      <w:numFmt w:val="decimal"/>
+      <w:lvlText w:val="%7."/>
+      <w:lvlJc w:val="left"/>
+      <w:pPr>
+        <w:ind w:left="5040" w:hanging="360"/>
+      </w:pPr>
+    </w:lvl>
+    <w:lvl w:ilvl="7" w:tplc="20000019" w:tentative="1">
+      <w:start w:val="1"/>
+      <w:numFmt w:val="lowerLetter"/>
+      <w:lvlText w:val="%8."/>
+      <w:lvlJc w:val="left"/>
+      <w:pPr>
+        <w:ind w:left="5760" w:hanging="360"/>
+      </w:pPr>
+    </w:lvl>
+    <w:lvl w:ilvl="8" w:tplc="2000001B" w:tentative="1">
+      <w:start w:val="1"/>
+      <w:numFmt w:val="lowerRoman"/>
+      <w:lvlText w:val="%9."/>
+      <w:lvlJc w:val="right"/>
+      <w:pPr>
+        <w:ind w:left="6480" w:hanging="180"/>
+      </w:pPr>
+    </w:lvl>
+  </w:abstractNum>
+  <w:abstractNum w:abstractNumId="3" w15:restartNumberingAfterBreak="0">
+    <w:nsid w:val="797C4F6D"/>
+    <w:multiLevelType w:val="hybridMultilevel"/>
+    <w:tmpl w:val="4248228C"/>
+    <w:lvl w:ilvl="0" w:tplc="A858A724">
+      <w:start w:val="1"/>
+      <w:numFmt w:val="decimal"/>
+      <w:lvlText w:val="%1."/>
+      <w:lvlJc w:val="left"/>
+      <w:pPr>
+        <w:ind w:left="720" w:hanging="360"/>
+      </w:pPr>
+      <w:rPr>
+        <w:rFonts w:hint="default"/>
+        <w:lang w:val="en-US"/>
+      </w:rPr>
+    </w:lvl>
+    <w:lvl w:ilvl="1" w:tplc="20000019" w:tentative="1">
+      <w:start w:val="1"/>
+      <w:numFmt w:val="lowerLetter"/>
+      <w:lvlText w:val="%2."/>
+      <w:lvlJc w:val="left"/>
+      <w:pPr>
+        <w:ind w:left="1440" w:hanging="360"/>
+      </w:pPr>
+    </w:lvl>
+    <w:lvl w:ilvl="2" w:tplc="2000001B" w:tentative="1">
+      <w:start w:val="1"/>
+      <w:numFmt w:val="lowerRoman"/>
+      <w:lvlText w:val="%3."/>
+      <w:lvlJc w:val="right"/>
+      <w:pPr>
+        <w:ind w:left="2160" w:hanging="180"/>
+      </w:pPr>
+    </w:lvl>
+    <w:lvl w:ilvl="3" w:tplc="2000000F" w:tentative="1">
+      <w:start w:val="1"/>
+      <w:numFmt w:val="decimal"/>
+      <w:lvlText w:val="%4."/>
+      <w:lvlJc w:val="left"/>
+      <w:pPr>
+        <w:ind w:left="2880" w:hanging="360"/>
+      </w:pPr>
+    </w:lvl>
+    <w:lvl w:ilvl="4" w:tplc="20000019" w:tentative="1">
+      <w:start w:val="1"/>
+      <w:numFmt w:val="lowerLetter"/>
+      <w:lvlText w:val="%5."/>
+      <w:lvlJc w:val="left"/>
+      <w:pPr>
+        <w:ind w:left="3600" w:hanging="360"/>
+      </w:pPr>
+    </w:lvl>
+    <w:lvl w:ilvl="5" w:tplc="2000001B" w:tentative="1">
+      <w:start w:val="1"/>
+      <w:numFmt w:val="lowerRoman"/>
+      <w:lvlText w:val="%6."/>
+      <w:lvlJc w:val="right"/>
+      <w:pPr>
+        <w:ind w:left="4320" w:hanging="180"/>
+      </w:pPr>
+    </w:lvl>
+    <w:lvl w:ilvl="6" w:tplc="2000000F" w:tentative="1">
+      <w:start w:val="1"/>
+      <w:numFmt w:val="decimal"/>
+      <w:lvlText w:val="%7."/>
+      <w:lvlJc w:val="left"/>
+      <w:pPr>
+        <w:ind w:left="5040" w:hanging="360"/>
+      </w:pPr>
+    </w:lvl>
+    <w:lvl w:ilvl="7" w:tplc="20000019" w:tentative="1">
+      <w:start w:val="1"/>
+      <w:numFmt w:val="lowerLetter"/>
+      <w:lvlText w:val="%8."/>
+      <w:lvlJc w:val="left"/>
+      <w:pPr>
+        <w:ind w:left="5760" w:hanging="360"/>
+      </w:pPr>
+    </w:lvl>
+    <w:lvl w:ilvl="8" w:tplc="2000001B" w:tentative="1">
+      <w:start w:val="1"/>
+      <w:numFmt w:val="lowerRoman"/>
+      <w:lvlText w:val="%9."/>
+      <w:lvlJc w:val="right"/>
+      <w:pPr>
+        <w:ind w:left="6480" w:hanging="180"/>
+      </w:pPr>
     </w:lvl>
   </w:abstractNum>
   <w:num w:numId="1" w16cid:durableId="1619481490">
@@ -1295,6 +3661,12 @@
   </w:num>
   <w:num w:numId="11" w16cid:durableId="52588802">
     <w:abstractNumId w:val="1"/>
+  </w:num>
+  <w:num w:numId="12" w16cid:durableId="1616208947">
+    <w:abstractNumId w:val="3"/>
+  </w:num>
+  <w:num w:numId="13" w16cid:durableId="255289337">
+    <w:abstractNumId w:val="2"/>
   </w:num>
 </w:numbering>
 </file>
@@ -1954,6 +4326,7 @@
   <w:style w:type="character" w:default="1" w:styleId="DefaultParagraphFont">
     <w:name w:val="Default Paragraph Font"/>
     <w:uiPriority w:val="1"/>
+    <w:semiHidden/>
     <w:unhideWhenUsed/>
   </w:style>
   <w:style w:type="table" w:default="1" w:styleId="TableNormal">
@@ -2373,6 +4746,29 @@
       <w:outlineLvl w:val="9"/>
     </w:pPr>
   </w:style>
+  <w:style w:type="character" w:styleId="Hyperlink">
+    <w:name w:val="Hyperlink"/>
+    <w:basedOn w:val="DefaultParagraphFont"/>
+    <w:uiPriority w:val="99"/>
+    <w:unhideWhenUsed/>
+    <w:rsid w:val="002C2034"/>
+    <w:rPr>
+      <w:color w:val="467886" w:themeColor="hyperlink"/>
+      <w:u w:val="single"/>
+    </w:rPr>
+  </w:style>
+  <w:style w:type="character" w:styleId="UnresolvedMention">
+    <w:name w:val="Unresolved Mention"/>
+    <w:basedOn w:val="DefaultParagraphFont"/>
+    <w:uiPriority w:val="99"/>
+    <w:semiHidden/>
+    <w:unhideWhenUsed/>
+    <w:rsid w:val="002C2034"/>
+    <w:rPr>
+      <w:color w:val="605E5C"/>
+      <w:shd w:val="clear" w:color="auto" w:fill="E1DFDD"/>
+    </w:rPr>
+  </w:style>
 </w:styles>
 </file>
 

</xml_diff>

<commit_message>
Add phase 01 and 03 docs, rename screenshots, update README
- Added docs/01-planning.md (network and host planning)
- Added docs/03-ou-design.md (OU design, license activation fix, stale DNS cleanup)
- Renamed screenshots 01 to 03 to fix typos and spaces in the file names
- Fixed the image link in docs/02 to match the renamed screenshot
- Added screenshots 04 to 06 (PowerShell group creation and the group existence loop)
- Updated raw notes with entries from 2026-09-07 to 2026-09-28
- Updated README phase table row 03 and the Result section
</commit_message>
<xml_diff>
--- a/raw-notes/AD DS Documentation.docx
+++ b/raw-notes/AD DS Documentation.docx
@@ -2524,7 +2524,6 @@
         <w:pStyle w:val="IntenseQuote"/>
       </w:pPr>
       <w:r>
-        <w:lastRenderedPageBreak/>
         <w:t>Get-</w:t>
       </w:r>
       <w:proofErr w:type="spellStart"/>
@@ -2638,14 +2637,28 @@
         <w:rPr>
           <w:lang w:val="en-US"/>
         </w:rPr>
-        <w:t xml:space="preserve"> "Bengt" -Surname "Karlsson" -</w:t>
-      </w:r>
-      <w:proofErr w:type="spellStart"/>
-      <w:r>
-        <w:rPr>
-          <w:lang w:val="en-US"/>
-        </w:rPr>
-        <w:t>SamAccountName</w:t>
+        <w:t xml:space="preserve"> "Bengt" -Surname "Karlsson" -SamAccountName "</w:t>
+      </w:r>
+      <w:proofErr w:type="spellStart"/>
+      <w:r>
+        <w:rPr>
+          <w:lang w:val="en-US"/>
+        </w:rPr>
+        <w:t>BengtKarlsson</w:t>
+      </w:r>
+      <w:proofErr w:type="spellEnd"/>
+      <w:r>
+        <w:rPr>
+          <w:lang w:val="en-US"/>
+        </w:rPr>
+        <w:t>" -</w:t>
+      </w:r>
+      <w:proofErr w:type="spellStart"/>
+      <w:r>
+        <w:rPr>
+          <w:lang w:val="en-US"/>
+        </w:rPr>
+        <w:t>UserPrinicalName</w:t>
       </w:r>
       <w:proofErr w:type="spellEnd"/>
       <w:r>
@@ -2659,6 +2672,130 @@
         <w:rPr>
           <w:lang w:val="en-US"/>
         </w:rPr>
+        <w:t>bengtkarlsson@homelab.local</w:t>
+      </w:r>
+      <w:proofErr w:type="spellEnd"/>
+      <w:r>
+        <w:rPr>
+          <w:lang w:val="en-US"/>
+        </w:rPr>
+        <w:t>" -</w:t>
+      </w:r>
+      <w:proofErr w:type="spellStart"/>
+      <w:r>
+        <w:rPr>
+          <w:lang w:val="en-US"/>
+        </w:rPr>
+        <w:t>AccountPassword</w:t>
+      </w:r>
+      <w:proofErr w:type="spellEnd"/>
+      <w:r>
+        <w:rPr>
+          <w:lang w:val="en-US"/>
+        </w:rPr>
+        <w:t xml:space="preserve"> (ConvertTo-SecureString "</w:t>
+      </w:r>
+      <w:r>
+        <w:rPr>
+          <w:lang w:val="en-US"/>
+        </w:rPr>
+        <w:t>&lt;placeholder-password&gt;</w:t>
+      </w:r>
+      <w:r>
+        <w:rPr>
+          <w:lang w:val="en-US"/>
+        </w:rPr>
+        <w:t>" -AsPlainText -Force) -</w:t>
+      </w:r>
+      <w:proofErr w:type="spellStart"/>
+      <w:r>
+        <w:rPr>
+          <w:lang w:val="en-US"/>
+        </w:rPr>
+        <w:t>ChangePasswordAtLogon</w:t>
+      </w:r>
+      <w:proofErr w:type="spellEnd"/>
+      <w:r>
+        <w:rPr>
+          <w:lang w:val="en-US"/>
+        </w:rPr>
+        <w:t xml:space="preserve"> $True -DisplayName "Bengt Karlsson" -Enabled $True</w:t>
+      </w:r>
+    </w:p>
+    <w:p>
+      <w:r>
+        <w:t>Detta gav mig ett e</w:t>
+      </w:r>
+      <w:r>
+        <w:t>rror på grund av att jag stavat fel på ’-UserPrincipalName’. Insåg inte detta först så jag tog bort ’-UserPrincipalName’ helt och försökte på nytt:</w:t>
+      </w:r>
+    </w:p>
+    <w:p>
+      <w:pPr>
+        <w:pStyle w:val="IntenseQuote"/>
+        <w:rPr>
+          <w:lang w:val="en-US"/>
+        </w:rPr>
+      </w:pPr>
+      <w:r>
+        <w:rPr>
+          <w:lang w:val="en-US"/>
+        </w:rPr>
+        <w:t>New-</w:t>
+      </w:r>
+      <w:proofErr w:type="spellStart"/>
+      <w:r>
+        <w:rPr>
+          <w:lang w:val="en-US"/>
+        </w:rPr>
+        <w:t>ADUser</w:t>
+      </w:r>
+      <w:proofErr w:type="spellEnd"/>
+      <w:r>
+        <w:rPr>
+          <w:lang w:val="en-US"/>
+        </w:rPr>
+        <w:t xml:space="preserve"> -Name "Bengt Karlsson" -Path "OU=IT,DC=</w:t>
+      </w:r>
+      <w:proofErr w:type="spellStart"/>
+      <w:r>
+        <w:rPr>
+          <w:lang w:val="en-US"/>
+        </w:rPr>
+        <w:t>homelab.local</w:t>
+      </w:r>
+      <w:proofErr w:type="spellEnd"/>
+      <w:r>
+        <w:rPr>
+          <w:lang w:val="en-US"/>
+        </w:rPr>
+        <w:t xml:space="preserve">" </w:t>
+      </w:r>
+      <w:r>
+        <w:rPr>
+          <w:lang w:val="en-US"/>
+        </w:rPr>
+        <w:t>-</w:t>
+      </w:r>
+      <w:proofErr w:type="spellStart"/>
+      <w:r>
+        <w:rPr>
+          <w:lang w:val="en-US"/>
+        </w:rPr>
+        <w:t>GivenName</w:t>
+      </w:r>
+      <w:proofErr w:type="spellEnd"/>
+      <w:r>
+        <w:rPr>
+          <w:lang w:val="en-US"/>
+        </w:rPr>
+        <w:t xml:space="preserve"> "Bengt" -Surname "Karlsson" -SamAccountName "</w:t>
+      </w:r>
+      <w:proofErr w:type="spellStart"/>
+      <w:r>
+        <w:rPr>
+          <w:lang w:val="en-US"/>
+        </w:rPr>
         <w:t>BengtKarlsson</w:t>
       </w:r>
       <w:proofErr w:type="spellEnd"/>
@@ -2673,21 +2810,169 @@
         <w:rPr>
           <w:lang w:val="en-US"/>
         </w:rPr>
-        <w:t>UserPrinicalName</w:t>
-      </w:r>
-      <w:proofErr w:type="spellEnd"/>
-      <w:r>
-        <w:rPr>
-          <w:lang w:val="en-US"/>
-        </w:rPr>
-        <w:t xml:space="preserve"> "</w:t>
-      </w:r>
-      <w:proofErr w:type="spellStart"/>
-      <w:r>
-        <w:rPr>
-          <w:lang w:val="en-US"/>
-        </w:rPr>
-        <w:t>bengtkarlsson@homelab.local</w:t>
+        <w:t>AccountPassword</w:t>
+      </w:r>
+      <w:proofErr w:type="spellEnd"/>
+      <w:r>
+        <w:rPr>
+          <w:lang w:val="en-US"/>
+        </w:rPr>
+        <w:t xml:space="preserve"> (ConvertTo-SecureString </w:t>
+      </w:r>
+      <w:r>
+        <w:rPr>
+          <w:lang w:val="en-US"/>
+        </w:rPr>
+        <w:t>“&lt;placeholder-password&gt;</w:t>
+      </w:r>
+      <w:r>
+        <w:rPr>
+          <w:lang w:val="en-US"/>
+        </w:rPr>
+        <w:t>" -AsPlainText -Force) -</w:t>
+      </w:r>
+      <w:proofErr w:type="spellStart"/>
+      <w:r>
+        <w:rPr>
+          <w:lang w:val="en-US"/>
+        </w:rPr>
+        <w:t>ChangePasswordAtLogon</w:t>
+      </w:r>
+      <w:proofErr w:type="spellEnd"/>
+      <w:r>
+        <w:rPr>
+          <w:lang w:val="en-US"/>
+        </w:rPr>
+        <w:t xml:space="preserve"> $True -DisplayName "Bengt Karlsson" -Enabled $True</w:t>
+      </w:r>
+    </w:p>
+    <w:p>
+      <w:r>
+        <w:t xml:space="preserve">Fick error här på </w:t>
+      </w:r>
+      <w:r>
+        <w:t>’</w:t>
+      </w:r>
+      <w:r>
+        <w:t>-</w:t>
+      </w:r>
+      <w:r>
+        <w:t>Path’, detta var för att jag inte delat upp ’</w:t>
+      </w:r>
+      <w:proofErr w:type="spellStart"/>
+      <w:r>
+        <w:t>homelab.local</w:t>
+      </w:r>
+      <w:proofErr w:type="spellEnd"/>
+      <w:r>
+        <w:t xml:space="preserve">’, det ska tydligen delas upp i stil med var allting ligger, i vilken ordning. Såsom: </w:t>
+      </w:r>
+    </w:p>
+    <w:p>
+      <w:pPr>
+        <w:pStyle w:val="IntenseQuote"/>
+      </w:pPr>
+      <w:r>
+        <w:t>-Path ”OU=IT,DC=homelab,DC=</w:t>
+      </w:r>
+      <w:proofErr w:type="spellStart"/>
+      <w:r>
+        <w:t>local</w:t>
+      </w:r>
+      <w:proofErr w:type="spellEnd"/>
+      <w:r>
+        <w:t>”</w:t>
+      </w:r>
+    </w:p>
+    <w:p>
+      <w:r>
+        <w:t xml:space="preserve">Detta berättar nu att </w:t>
+      </w:r>
+      <w:proofErr w:type="spellStart"/>
+      <w:r>
+        <w:t>OU:n</w:t>
+      </w:r>
+      <w:proofErr w:type="spellEnd"/>
+      <w:r>
+        <w:t xml:space="preserve"> IT ligger i </w:t>
+      </w:r>
+      <w:proofErr w:type="spellStart"/>
+      <w:r>
+        <w:t>homelab</w:t>
+      </w:r>
+      <w:proofErr w:type="spellEnd"/>
+      <w:r>
+        <w:t xml:space="preserve"> som ligger i </w:t>
+      </w:r>
+      <w:proofErr w:type="spellStart"/>
+      <w:r>
+        <w:t>local</w:t>
+      </w:r>
+      <w:proofErr w:type="spellEnd"/>
+      <w:r>
+        <w:t>.</w:t>
+      </w:r>
+    </w:p>
+    <w:p>
+      <w:r>
+        <w:t>Hela New-</w:t>
+      </w:r>
+      <w:proofErr w:type="spellStart"/>
+      <w:r>
+        <w:t>ADUser</w:t>
+      </w:r>
+      <w:proofErr w:type="spellEnd"/>
+      <w:r>
+        <w:t xml:space="preserve"> kommandot som fungerade:</w:t>
+      </w:r>
+    </w:p>
+    <w:p>
+      <w:pPr>
+        <w:pStyle w:val="IntenseQuote"/>
+        <w:rPr>
+          <w:lang w:val="en-US"/>
+        </w:rPr>
+      </w:pPr>
+      <w:r>
+        <w:rPr>
+          <w:lang w:val="en-US"/>
+        </w:rPr>
+        <w:t>New-</w:t>
+      </w:r>
+      <w:proofErr w:type="spellStart"/>
+      <w:r>
+        <w:rPr>
+          <w:lang w:val="en-US"/>
+        </w:rPr>
+        <w:t>ADUser</w:t>
+      </w:r>
+      <w:proofErr w:type="spellEnd"/>
+      <w:r>
+        <w:rPr>
+          <w:lang w:val="en-US"/>
+        </w:rPr>
+        <w:t xml:space="preserve"> -Name "Bengt Karlsson" -Path "OU=IT,DC=homelab,DC=local" -</w:t>
+      </w:r>
+      <w:proofErr w:type="spellStart"/>
+      <w:r>
+        <w:rPr>
+          <w:lang w:val="en-US"/>
+        </w:rPr>
+        <w:t>GivenName</w:t>
+      </w:r>
+      <w:proofErr w:type="spellEnd"/>
+      <w:r>
+        <w:rPr>
+          <w:lang w:val="en-US"/>
+        </w:rPr>
+        <w:t xml:space="preserve"> "Bengt" -Surname "Karlsson" -SamAccountName "</w:t>
+      </w:r>
+      <w:proofErr w:type="spellStart"/>
+      <w:r>
+        <w:rPr>
+          <w:lang w:val="en-US"/>
+        </w:rPr>
+        <w:t>BengtKarlsson</w:t>
       </w:r>
       <w:proofErr w:type="spellEnd"/>
       <w:r>
@@ -2708,7 +2993,19 @@
         <w:rPr>
           <w:lang w:val="en-US"/>
         </w:rPr>
-        <w:t xml:space="preserve"> (ConvertTo-SecureString "Qwerty123!" -AsPlainText -Force) -</w:t>
+        <w:t xml:space="preserve"> (ConvertTo-SecureString "</w:t>
+      </w:r>
+      <w:r>
+        <w:rPr>
+          <w:lang w:val="en-US"/>
+        </w:rPr>
+        <w:t>&lt;placeholder-password&gt;</w:t>
+      </w:r>
+      <w:r>
+        <w:rPr>
+          <w:lang w:val="en-US"/>
+        </w:rPr>
+        <w:t>" -AsPlainText -Force) -</w:t>
       </w:r>
       <w:proofErr w:type="spellStart"/>
       <w:r>
@@ -2727,26 +3024,33 @@
     </w:p>
     <w:p>
       <w:r>
-        <w:t>Detta gav mig ett e</w:t>
-      </w:r>
-      <w:r>
-        <w:t>rror på grund av att jag stavat fel på ’-</w:t>
-      </w:r>
-      <w:proofErr w:type="spellStart"/>
-      <w:r>
-        <w:t>UserPrincipalName</w:t>
-      </w:r>
-      <w:proofErr w:type="spellEnd"/>
-      <w:r>
-        <w:t>’. Insåg inte detta först så jag tog bort ’-</w:t>
-      </w:r>
-      <w:proofErr w:type="spellStart"/>
-      <w:r>
-        <w:t>UserPrincipalName</w:t>
-      </w:r>
-      <w:proofErr w:type="spellEnd"/>
-      <w:r>
-        <w:t>’ helt och försökte på nytt:</w:t>
+        <w:t xml:space="preserve">Detta skapade </w:t>
+      </w:r>
+      <w:r>
+        <w:t>användaren</w:t>
+      </w:r>
+      <w:r>
+        <w:t xml:space="preserve"> “Bengt </w:t>
+      </w:r>
+      <w:r>
+        <w:t>K</w:t>
+      </w:r>
+      <w:r>
+        <w:t>a</w:t>
+      </w:r>
+      <w:r>
+        <w:t>rlsson” men ingen satt</w:t>
+      </w:r>
+      <w:r>
+        <w:t xml:space="preserve"> ’-UserPrincipalName’. Insåg att jag endast hade stavat fel och försökte, och lyckades, lösa detta med ’Set-</w:t>
+      </w:r>
+      <w:proofErr w:type="spellStart"/>
+      <w:r>
+        <w:t>ADUser</w:t>
+      </w:r>
+      <w:proofErr w:type="spellEnd"/>
+      <w:r>
+        <w:t>’ kommandot:</w:t>
       </w:r>
     </w:p>
     <w:p>
@@ -2760,7 +3064,7 @@
         <w:rPr>
           <w:lang w:val="en-US"/>
         </w:rPr>
-        <w:t>New-</w:t>
+        <w:t>Set-</w:t>
       </w:r>
       <w:proofErr w:type="spellStart"/>
       <w:r>
@@ -2774,49 +3078,7 @@
         <w:rPr>
           <w:lang w:val="en-US"/>
         </w:rPr>
-        <w:t xml:space="preserve"> -Name "Bengt Karlsson" -Path "OU=IT,DC=</w:t>
-      </w:r>
-      <w:proofErr w:type="spellStart"/>
-      <w:r>
-        <w:rPr>
-          <w:lang w:val="en-US"/>
-        </w:rPr>
-        <w:t>homelab.local</w:t>
-      </w:r>
-      <w:proofErr w:type="spellEnd"/>
-      <w:r>
-        <w:rPr>
-          <w:lang w:val="en-US"/>
-        </w:rPr>
-        <w:t>" -</w:t>
-      </w:r>
-      <w:proofErr w:type="spellStart"/>
-      <w:r>
-        <w:rPr>
-          <w:lang w:val="en-US"/>
-        </w:rPr>
-        <w:t>GivenName</w:t>
-      </w:r>
-      <w:proofErr w:type="spellEnd"/>
-      <w:r>
-        <w:rPr>
-          <w:lang w:val="en-US"/>
-        </w:rPr>
-        <w:t xml:space="preserve"> "Bengt" -Surname "Karlsson" -</w:t>
-      </w:r>
-      <w:proofErr w:type="spellStart"/>
-      <w:r>
-        <w:rPr>
-          <w:lang w:val="en-US"/>
-        </w:rPr>
-        <w:t>SamAccountName</w:t>
-      </w:r>
-      <w:proofErr w:type="spellEnd"/>
-      <w:r>
-        <w:rPr>
-          <w:lang w:val="en-US"/>
-        </w:rPr>
-        <w:t xml:space="preserve"> "</w:t>
+        <w:t xml:space="preserve"> -Identity "</w:t>
       </w:r>
       <w:proofErr w:type="spellStart"/>
       <w:r>
@@ -2830,323 +3092,7 @@
         <w:rPr>
           <w:lang w:val="en-US"/>
         </w:rPr>
-        <w:t>" -</w:t>
-      </w:r>
-      <w:proofErr w:type="spellStart"/>
-      <w:r>
-        <w:rPr>
-          <w:lang w:val="en-US"/>
-        </w:rPr>
-        <w:t>AccountPassword</w:t>
-      </w:r>
-      <w:proofErr w:type="spellEnd"/>
-      <w:r>
-        <w:rPr>
-          <w:lang w:val="en-US"/>
-        </w:rPr>
-        <w:t xml:space="preserve"> (ConvertTo-SecureString "Qwerty123!" -AsPlainText -Force) -</w:t>
-      </w:r>
-      <w:proofErr w:type="spellStart"/>
-      <w:r>
-        <w:rPr>
-          <w:lang w:val="en-US"/>
-        </w:rPr>
-        <w:t>ChangePasswordAtLogon</w:t>
-      </w:r>
-      <w:proofErr w:type="spellEnd"/>
-      <w:r>
-        <w:rPr>
-          <w:lang w:val="en-US"/>
-        </w:rPr>
-        <w:t xml:space="preserve"> $True -DisplayName "Bengt Karlsson" -Enabled $True</w:t>
-      </w:r>
-    </w:p>
-    <w:p>
-      <w:r>
-        <w:t xml:space="preserve">Fick error här på </w:t>
-      </w:r>
-      <w:r>
-        <w:t>’</w:t>
-      </w:r>
-      <w:r>
-        <w:t>-</w:t>
-      </w:r>
-      <w:proofErr w:type="spellStart"/>
-      <w:r>
-        <w:t>Path</w:t>
-      </w:r>
-      <w:proofErr w:type="spellEnd"/>
-      <w:r>
-        <w:t>’, detta var för att jag inte delat upp ’</w:t>
-      </w:r>
-      <w:proofErr w:type="spellStart"/>
-      <w:r>
-        <w:t>homelab.local</w:t>
-      </w:r>
-      <w:proofErr w:type="spellEnd"/>
-      <w:r>
-        <w:t xml:space="preserve">’, det ska tydligen delas upp i stil med var allting ligger, i vilken ordning. Såsom: </w:t>
-      </w:r>
-    </w:p>
-    <w:p>
-      <w:pPr>
-        <w:pStyle w:val="IntenseQuote"/>
-      </w:pPr>
-      <w:r>
-        <w:t>-</w:t>
-      </w:r>
-      <w:proofErr w:type="spellStart"/>
-      <w:r>
-        <w:t>Path</w:t>
-      </w:r>
-      <w:proofErr w:type="spellEnd"/>
-      <w:r>
-        <w:t xml:space="preserve"> ”OU=IT,DC=homelab,DC=</w:t>
-      </w:r>
-      <w:proofErr w:type="spellStart"/>
-      <w:r>
-        <w:t>local</w:t>
-      </w:r>
-      <w:proofErr w:type="spellEnd"/>
-      <w:r>
-        <w:t>”</w:t>
-      </w:r>
-    </w:p>
-    <w:p>
-      <w:r>
-        <w:t xml:space="preserve">Detta berättar nu att </w:t>
-      </w:r>
-      <w:proofErr w:type="spellStart"/>
-      <w:r>
-        <w:t>OU:n</w:t>
-      </w:r>
-      <w:proofErr w:type="spellEnd"/>
-      <w:r>
-        <w:t xml:space="preserve"> IT ligger i </w:t>
-      </w:r>
-      <w:proofErr w:type="spellStart"/>
-      <w:r>
-        <w:t>homelab</w:t>
-      </w:r>
-      <w:proofErr w:type="spellEnd"/>
-      <w:r>
-        <w:t xml:space="preserve"> som ligger i </w:t>
-      </w:r>
-      <w:proofErr w:type="spellStart"/>
-      <w:r>
-        <w:t>local</w:t>
-      </w:r>
-      <w:proofErr w:type="spellEnd"/>
-      <w:r>
-        <w:t>.</w:t>
-      </w:r>
-    </w:p>
-    <w:p>
-      <w:r>
-        <w:t>Hela New-</w:t>
-      </w:r>
-      <w:proofErr w:type="spellStart"/>
-      <w:r>
-        <w:t>ADUser</w:t>
-      </w:r>
-      <w:proofErr w:type="spellEnd"/>
-      <w:r>
-        <w:t xml:space="preserve"> kommandot som fungerade:</w:t>
-      </w:r>
-    </w:p>
-    <w:p>
-      <w:pPr>
-        <w:pStyle w:val="IntenseQuote"/>
-        <w:rPr>
-          <w:lang w:val="en-US"/>
-        </w:rPr>
-      </w:pPr>
-      <w:r>
-        <w:rPr>
-          <w:lang w:val="en-US"/>
-        </w:rPr>
-        <w:t>New-</w:t>
-      </w:r>
-      <w:proofErr w:type="spellStart"/>
-      <w:r>
-        <w:rPr>
-          <w:lang w:val="en-US"/>
-        </w:rPr>
-        <w:t>ADUser</w:t>
-      </w:r>
-      <w:proofErr w:type="spellEnd"/>
-      <w:r>
-        <w:rPr>
-          <w:lang w:val="en-US"/>
-        </w:rPr>
-        <w:t xml:space="preserve"> -Name "Bengt Karlsson" -Path "OU=IT,DC=homelab,DC=local" -</w:t>
-      </w:r>
-      <w:proofErr w:type="spellStart"/>
-      <w:r>
-        <w:rPr>
-          <w:lang w:val="en-US"/>
-        </w:rPr>
-        <w:t>GivenName</w:t>
-      </w:r>
-      <w:proofErr w:type="spellEnd"/>
-      <w:r>
-        <w:rPr>
-          <w:lang w:val="en-US"/>
-        </w:rPr>
-        <w:t xml:space="preserve"> "Bengt" -Surname "Karlsson" -</w:t>
-      </w:r>
-      <w:proofErr w:type="spellStart"/>
-      <w:r>
-        <w:rPr>
-          <w:lang w:val="en-US"/>
-        </w:rPr>
-        <w:t>SamAccountName</w:t>
-      </w:r>
-      <w:proofErr w:type="spellEnd"/>
-      <w:r>
-        <w:rPr>
-          <w:lang w:val="en-US"/>
-        </w:rPr>
-        <w:t xml:space="preserve"> "</w:t>
-      </w:r>
-      <w:proofErr w:type="spellStart"/>
-      <w:r>
-        <w:rPr>
-          <w:lang w:val="en-US"/>
-        </w:rPr>
-        <w:t>BengtKarlsson</w:t>
-      </w:r>
-      <w:proofErr w:type="spellEnd"/>
-      <w:r>
-        <w:rPr>
-          <w:lang w:val="en-US"/>
-        </w:rPr>
-        <w:t>" -</w:t>
-      </w:r>
-      <w:proofErr w:type="spellStart"/>
-      <w:r>
-        <w:rPr>
-          <w:lang w:val="en-US"/>
-        </w:rPr>
-        <w:t>AccountPassword</w:t>
-      </w:r>
-      <w:proofErr w:type="spellEnd"/>
-      <w:r>
-        <w:rPr>
-          <w:lang w:val="en-US"/>
-        </w:rPr>
-        <w:t xml:space="preserve"> (ConvertTo-SecureString "Qwerty123!" -AsPlainText -Force) -</w:t>
-      </w:r>
-      <w:proofErr w:type="spellStart"/>
-      <w:r>
-        <w:rPr>
-          <w:lang w:val="en-US"/>
-        </w:rPr>
-        <w:t>ChangePasswordAtLogon</w:t>
-      </w:r>
-      <w:proofErr w:type="spellEnd"/>
-      <w:r>
-        <w:rPr>
-          <w:lang w:val="en-US"/>
-        </w:rPr>
-        <w:t xml:space="preserve"> $True -DisplayName "Bengt Karlsson" -Enabled $True</w:t>
-      </w:r>
-    </w:p>
-    <w:p>
-      <w:r>
-        <w:t xml:space="preserve">Detta skapade </w:t>
-      </w:r>
-      <w:proofErr w:type="spellStart"/>
-      <w:r>
-        <w:t>Usern</w:t>
-      </w:r>
-      <w:proofErr w:type="spellEnd"/>
-      <w:r>
-        <w:t xml:space="preserve"> “Bengt </w:t>
-      </w:r>
-      <w:r>
-        <w:t>K</w:t>
-      </w:r>
-      <w:r>
-        <w:t>a</w:t>
-      </w:r>
-      <w:r>
-        <w:t>rlsson” men ingen satt</w:t>
-      </w:r>
-      <w:r>
-        <w:t xml:space="preserve"> ’-</w:t>
-      </w:r>
-      <w:proofErr w:type="spellStart"/>
-      <w:r>
-        <w:t>UserPrincipalName</w:t>
-      </w:r>
-      <w:proofErr w:type="spellEnd"/>
-      <w:r>
-        <w:t>’. Insåg att jag endast hade stavat fel och försökte, och lyckades, lösa detta med ’Set-</w:t>
-      </w:r>
-      <w:proofErr w:type="spellStart"/>
-      <w:r>
-        <w:t>ADUser</w:t>
-      </w:r>
-      <w:proofErr w:type="spellEnd"/>
-      <w:r>
-        <w:t>’ kommandot:</w:t>
-      </w:r>
-    </w:p>
-    <w:p>
-      <w:pPr>
-        <w:pStyle w:val="IntenseQuote"/>
-        <w:rPr>
-          <w:lang w:val="en-US"/>
-        </w:rPr>
-      </w:pPr>
-      <w:r>
-        <w:rPr>
-          <w:lang w:val="en-US"/>
-        </w:rPr>
-        <w:t>Set-</w:t>
-      </w:r>
-      <w:proofErr w:type="spellStart"/>
-      <w:r>
-        <w:rPr>
-          <w:lang w:val="en-US"/>
-        </w:rPr>
-        <w:t>ADUser</w:t>
-      </w:r>
-      <w:proofErr w:type="spellEnd"/>
-      <w:r>
-        <w:rPr>
-          <w:lang w:val="en-US"/>
-        </w:rPr>
-        <w:t xml:space="preserve"> -Identity "</w:t>
-      </w:r>
-      <w:proofErr w:type="spellStart"/>
-      <w:r>
-        <w:rPr>
-          <w:lang w:val="en-US"/>
-        </w:rPr>
-        <w:t>BengtKarlsson</w:t>
-      </w:r>
-      <w:proofErr w:type="spellEnd"/>
-      <w:r>
-        <w:rPr>
-          <w:lang w:val="en-US"/>
-        </w:rPr>
-        <w:t>" -</w:t>
-      </w:r>
-      <w:proofErr w:type="spellStart"/>
-      <w:r>
-        <w:rPr>
-          <w:lang w:val="en-US"/>
-        </w:rPr>
-        <w:t>UserPrincipalName</w:t>
-      </w:r>
-      <w:proofErr w:type="spellEnd"/>
-      <w:r>
-        <w:rPr>
-          <w:lang w:val="en-US"/>
-        </w:rPr>
-        <w:t xml:space="preserve"> </w:t>
+        <w:t xml:space="preserve">" -UserPrincipalName </w:t>
       </w:r>
       <w:r>
         <w:rPr>
@@ -3219,12 +3165,586 @@
     </w:p>
     <w:p>
       <w:pPr>
+        <w:pStyle w:val="Heading2"/>
         <w:rPr>
           <w:rStyle w:val="Emphasis"/>
           <w:i w:val="0"/>
           <w:iCs w:val="0"/>
         </w:rPr>
       </w:pPr>
+      <w:r>
+        <w:rPr>
+          <w:rStyle w:val="Emphasis"/>
+          <w:i w:val="0"/>
+          <w:iCs w:val="0"/>
+        </w:rPr>
+        <w:t>2026-09-28</w:t>
+      </w:r>
+    </w:p>
+    <w:p>
+      <w:r>
+        <w:t xml:space="preserve">Idag så la jag till Nya medlemmar samt Security group för de avdelningar som varit tomma, dvs. HR och Finance. </w:t>
+      </w:r>
+      <w:r>
+        <w:br/>
+      </w:r>
+      <w:r>
+        <w:br/>
+        <w:t>Jag gjorde detta genom PowerShell för att öva på att scripta. Jag la till de nya medlemmarna på samma vis som jag gjorde med vår ’IT’-användare ’Bengt Karlsson’, där jag nu satte</w:t>
+      </w:r>
+      <w:r>
+        <w:br/>
+        <w:t xml:space="preserve">-UserPrincipalName direkt vid skapandet i stället och placerade de nya medlemmarna i respektive OU med -Path kommandot. </w:t>
+      </w:r>
+      <w:r>
+        <w:t>Skapade användare till HR och Finance.</w:t>
+      </w:r>
+      <w:r>
+        <w:br/>
+      </w:r>
+      <w:r>
+        <w:br/>
+        <w:t xml:space="preserve">Efter det så skapade jag två nya Security-Groups också för avdelningarna: SG-IT, SG-HR och SG-Finance. De alla skapades med liknande kommando där endast -Name och -Path ändrades för respektive avdelning: </w:t>
+      </w:r>
+    </w:p>
+    <w:p>
+      <w:pPr>
+        <w:pStyle w:val="IntenseQuote"/>
+        <w:rPr>
+          <w:lang w:val="en-US"/>
+        </w:rPr>
+      </w:pPr>
+      <w:r>
+        <w:rPr>
+          <w:lang w:val="en-US"/>
+        </w:rPr>
+        <w:t>New-ADGroup -Name "SG-IT" -GroupCategory Security -GroupScope Global -Path "OU=IT,DC=homelab,DC=local" -Description "Members of this group are employees in the IT department"</w:t>
+      </w:r>
+    </w:p>
+    <w:p>
+      <w:r>
+        <w:t xml:space="preserve">Jag har inte skrivit med -SamAccountName i skapandet för att, till min förståelse, så blir det automatiskt samma som -Name om man inte specificerar något annat. </w:t>
+      </w:r>
+      <w:r>
+        <w:t xml:space="preserve">Lämnade även </w:t>
+      </w:r>
+      <w:r>
+        <w:br/>
+      </w:r>
+      <w:r>
+        <w:lastRenderedPageBreak/>
+        <w:t xml:space="preserve">-DisplayName orörd då jag anser att namnet i sig är självförklarande för vad gruppen är. Jag dubbelkollade hur grupperna såg ut </w:t>
+      </w:r>
+      <w:r>
+        <w:t xml:space="preserve">med </w:t>
+      </w:r>
+      <w:r>
+        <w:t xml:space="preserve">kommandot: </w:t>
+      </w:r>
+    </w:p>
+    <w:p>
+      <w:pPr>
+        <w:pStyle w:val="IntenseQuote"/>
+        <w:rPr>
+          <w:lang w:val="en-US"/>
+        </w:rPr>
+      </w:pPr>
+      <w:r>
+        <w:rPr>
+          <w:lang w:val="en-US"/>
+        </w:rPr>
+        <w:t>Get-ADGroup -Identity "SG-IT" -Properties SamAccountName, DisplayName</w:t>
+      </w:r>
+    </w:p>
+    <w:p>
+      <w:r>
+        <w:t>Lade sedan till de nya a</w:t>
+      </w:r>
+      <w:r>
+        <w:t>nvändarna jag skapade tidigare till deras respektive Security Group, där jag började med ’Bengt Karlsson’ till ’SG-IT’:</w:t>
+      </w:r>
+    </w:p>
+    <w:p>
+      <w:pPr>
+        <w:pStyle w:val="IntenseQuote"/>
+        <w:rPr>
+          <w:lang w:val="en-US"/>
+        </w:rPr>
+      </w:pPr>
+      <w:r>
+        <w:rPr>
+          <w:lang w:val="en-US"/>
+        </w:rPr>
+        <w:t>Add-</w:t>
+      </w:r>
+      <w:proofErr w:type="spellStart"/>
+      <w:r>
+        <w:rPr>
+          <w:lang w:val="en-US"/>
+        </w:rPr>
+        <w:t>ADGroupMember</w:t>
+      </w:r>
+      <w:proofErr w:type="spellEnd"/>
+      <w:r>
+        <w:rPr>
+          <w:lang w:val="en-US"/>
+        </w:rPr>
+        <w:t xml:space="preserve"> -Identity SG-IT -Members "</w:t>
+      </w:r>
+      <w:proofErr w:type="spellStart"/>
+      <w:r>
+        <w:rPr>
+          <w:lang w:val="en-US"/>
+        </w:rPr>
+        <w:t>BengtKarlsson</w:t>
+      </w:r>
+      <w:proofErr w:type="spellEnd"/>
+      <w:r>
+        <w:rPr>
+          <w:lang w:val="en-US"/>
+        </w:rPr>
+        <w:t>"</w:t>
+      </w:r>
+    </w:p>
+    <w:p>
+      <w:r>
+        <w:t xml:space="preserve">Efter att ha spenderat tid </w:t>
+      </w:r>
+      <w:r>
+        <w:t>med att kolla igenom PowerShell-dokumentationen om Active Directory på ’learn.microsoft.com’ lärde jag mig om ’-WhatIf’-parametern och hur man kan, med denna parameter, se vad ett kommando kan göra utan att det faktiskt gör det. Exempel:</w:t>
+      </w:r>
+    </w:p>
+    <w:p>
+      <w:pPr>
+        <w:pStyle w:val="IntenseQuote"/>
+        <w:rPr>
+          <w:lang w:val="en-US"/>
+        </w:rPr>
+      </w:pPr>
+      <w:r>
+        <w:rPr>
+          <w:lang w:val="en-US"/>
+        </w:rPr>
+        <w:t>‘</w:t>
+      </w:r>
+      <w:r>
+        <w:rPr>
+          <w:lang w:val="en-US"/>
+        </w:rPr>
+        <w:t>New-ADGroup -Name "SG-HR" -GroupCategory Security -GroupScope Global -Path "OU=HR,DC=homelab,DC=local" -Description "Members of this group are employees in the Human Resources department" -WhatIf</w:t>
+      </w:r>
+      <w:r>
+        <w:rPr>
+          <w:lang w:val="en-US"/>
+        </w:rPr>
+        <w:t>’</w:t>
+      </w:r>
+      <w:r>
+        <w:rPr>
+          <w:lang w:val="en-US"/>
+        </w:rPr>
+        <w:t xml:space="preserve">                     </w:t>
+      </w:r>
+    </w:p>
+    <w:p>
+      <w:pPr>
+        <w:pStyle w:val="IntenseQuote"/>
+        <w:rPr>
+          <w:lang w:val="en-US"/>
+        </w:rPr>
+      </w:pPr>
+      <w:r>
+        <w:rPr>
+          <w:lang w:val="en-US"/>
+        </w:rPr>
+        <w:t>What if: Performing the operation "New" on target "CN=SG-HR,OU=HR,DC=homelab,DC=local".</w:t>
+      </w:r>
+    </w:p>
+    <w:p>
+      <w:r>
+        <w:t xml:space="preserve">Jag testade mig även fram till att kunna loopa adderandet av grupper, då jag insåg att det inte var något annat än avdelnings namnet som var skillnaden </w:t>
+      </w:r>
+      <w:r>
+        <w:t xml:space="preserve">vid skapandet av grupper. Med lite forskande så såg jag att man kunde ’scripta’ en foreach-loop som skapar nya grupper: </w:t>
+      </w:r>
+    </w:p>
+    <w:p>
+      <w:pPr>
+        <w:pStyle w:val="IntenseQuote"/>
+        <w:rPr>
+          <w:lang w:val="en-US"/>
+        </w:rPr>
+      </w:pPr>
+      <w:r>
+        <w:rPr>
+          <w:lang w:val="en-US"/>
+        </w:rPr>
+        <w:t>$</w:t>
+      </w:r>
+      <w:r>
+        <w:rPr>
+          <w:lang w:val="en-US"/>
+        </w:rPr>
+        <w:t>ou</w:t>
+      </w:r>
+      <w:r>
+        <w:rPr>
+          <w:lang w:val="en-US"/>
+        </w:rPr>
+        <w:t xml:space="preserve"> = "HR", "IT", "Finance", "Sales"</w:t>
+      </w:r>
+      <w:r>
+        <w:rPr>
+          <w:lang w:val="en-US"/>
+        </w:rPr>
+        <w:br/>
+        <w:t>foreach ($o in $ou) {</w:t>
+      </w:r>
+      <w:r>
+        <w:rPr>
+          <w:lang w:val="en-US"/>
+        </w:rPr>
+        <w:br/>
+        <w:t>New-ADGroup -Name "SG-$o" -GroupCategory Security -GroupScope Global -Path "OU=$o,DC=homelab,DC=local" -WhatIf }</w:t>
+      </w:r>
+    </w:p>
+    <w:p>
+      <w:r>
+        <w:t xml:space="preserve">Jag </w:t>
+      </w:r>
+      <w:r>
+        <w:t xml:space="preserve">använde </w:t>
+      </w:r>
+      <w:r>
+        <w:t>’</w:t>
+      </w:r>
+      <w:r>
+        <w:t>-WhatIf</w:t>
+      </w:r>
+      <w:r>
+        <w:t>’</w:t>
+      </w:r>
+      <w:r>
+        <w:t xml:space="preserve"> </w:t>
+      </w:r>
+      <w:r>
+        <w:t xml:space="preserve">då jag inte ville skapa grupperna, då de redan finns och hade säkerligen resulterat i error, utan jag ville endast se hur det hade fungerat. Detta var min första smak av att skripta i PowerShell vilket fick mig tanken att vilja bygga på detta skript till att fungera för framtida potentiella avdelningar. Skriptet ska först kolla ifall en avdelning redan finns och i de fall inte försöka skapa en grupp med samma namn, men ifall den inte hittar en grupp med namnet som anges så ska den skapa denna på samma vis som tidigare kommando. Detta tog längre tid än förväntat då jag inte riktigt förstod hur jag skulle få med kontrollen. </w:t>
+      </w:r>
+      <w:r>
+        <w:t xml:space="preserve">Men efter en del forskande och kopierande av liknande kommando så kom jag fram till detta: </w:t>
+      </w:r>
+    </w:p>
+    <w:p>
+      <w:pPr>
+        <w:pStyle w:val="IntenseQuote"/>
+        <w:rPr>
+          <w:rStyle w:val="IntenseQuoteChar"/>
+          <w:lang w:val="en-US"/>
+        </w:rPr>
+      </w:pPr>
+      <w:r>
+        <w:rPr>
+          <w:rStyle w:val="IntenseQuoteChar"/>
+          <w:lang w:val="en-US"/>
+        </w:rPr>
+        <w:t>$</w:t>
+      </w:r>
+      <w:r>
+        <w:rPr>
+          <w:rStyle w:val="IntenseQuoteChar"/>
+          <w:lang w:val="en-US"/>
+        </w:rPr>
+        <w:t>ou</w:t>
+      </w:r>
+      <w:r>
+        <w:rPr>
+          <w:rStyle w:val="IntenseQuoteChar"/>
+          <w:lang w:val="en-US"/>
+        </w:rPr>
+        <w:t xml:space="preserve"> = "HR", "IT", "Finance", "Sales"</w:t>
+      </w:r>
+      <w:r>
+        <w:rPr>
+          <w:rStyle w:val="IntenseQuoteChar"/>
+          <w:lang w:val="en-US"/>
+        </w:rPr>
+        <w:br/>
+      </w:r>
+      <w:r>
+        <w:rPr>
+          <w:rStyle w:val="IntenseQuoteChar"/>
+          <w:lang w:val="en-US"/>
+        </w:rPr>
+        <w:t>foreach ($</w:t>
+      </w:r>
+      <w:r>
+        <w:rPr>
+          <w:rStyle w:val="IntenseQuoteChar"/>
+          <w:lang w:val="en-US"/>
+        </w:rPr>
+        <w:t>o</w:t>
+      </w:r>
+      <w:r>
+        <w:rPr>
+          <w:rStyle w:val="IntenseQuoteChar"/>
+          <w:lang w:val="en-US"/>
+        </w:rPr>
+        <w:t xml:space="preserve"> in $</w:t>
+      </w:r>
+      <w:r>
+        <w:rPr>
+          <w:rStyle w:val="IntenseQuoteChar"/>
+          <w:lang w:val="en-US"/>
+        </w:rPr>
+        <w:t>ou</w:t>
+      </w:r>
+      <w:r>
+        <w:rPr>
+          <w:rStyle w:val="IntenseQuoteChar"/>
+          <w:lang w:val="en-US"/>
+        </w:rPr>
+        <w:t>) {</w:t>
+      </w:r>
+      <w:r>
+        <w:rPr>
+          <w:rStyle w:val="IntenseQuoteChar"/>
+          <w:lang w:val="en-US"/>
+        </w:rPr>
+        <w:br/>
+      </w:r>
+      <w:r>
+        <w:rPr>
+          <w:rStyle w:val="IntenseQuoteChar"/>
+          <w:lang w:val="en-US"/>
+        </w:rPr>
+        <w:t>$exists = Get-ADGroup -Filter "Name -eq 'SG-$</w:t>
+      </w:r>
+      <w:r>
+        <w:rPr>
+          <w:rStyle w:val="IntenseQuoteChar"/>
+          <w:lang w:val="en-US"/>
+        </w:rPr>
+        <w:t>o</w:t>
+      </w:r>
+      <w:r>
+        <w:rPr>
+          <w:rStyle w:val="IntenseQuoteChar"/>
+          <w:lang w:val="en-US"/>
+        </w:rPr>
+        <w:t>'"</w:t>
+      </w:r>
+      <w:r>
+        <w:rPr>
+          <w:rStyle w:val="IntenseQuoteChar"/>
+          <w:lang w:val="en-US"/>
+        </w:rPr>
+        <w:br/>
+      </w:r>
+      <w:r>
+        <w:rPr>
+          <w:rStyle w:val="IntenseQuoteChar"/>
+          <w:lang w:val="en-US"/>
+        </w:rPr>
+        <w:t xml:space="preserve"> if (-not $exists) {</w:t>
+      </w:r>
+      <w:r>
+        <w:rPr>
+          <w:rStyle w:val="IntenseQuoteChar"/>
+          <w:lang w:val="en-US"/>
+        </w:rPr>
+        <w:t xml:space="preserve"> </w:t>
+      </w:r>
+      <w:r>
+        <w:rPr>
+          <w:rStyle w:val="IntenseQuoteChar"/>
+          <w:lang w:val="en-US"/>
+        </w:rPr>
+        <w:br/>
+      </w:r>
+      <w:r>
+        <w:rPr>
+          <w:rStyle w:val="IntenseQuoteChar"/>
+          <w:lang w:val="en-US"/>
+        </w:rPr>
+        <w:t>Write-Host "SG-$</w:t>
+      </w:r>
+      <w:r>
+        <w:rPr>
+          <w:rStyle w:val="IntenseQuoteChar"/>
+          <w:lang w:val="en-US"/>
+        </w:rPr>
+        <w:t>o</w:t>
+      </w:r>
+      <w:r>
+        <w:rPr>
+          <w:rStyle w:val="IntenseQuoteChar"/>
+          <w:lang w:val="en-US"/>
+        </w:rPr>
+        <w:t xml:space="preserve"> missing, </w:t>
+      </w:r>
+      <w:r>
+        <w:rPr>
+          <w:rStyle w:val="IntenseQuoteChar"/>
+          <w:lang w:val="en-US"/>
+        </w:rPr>
+        <w:t>creating it now</w:t>
+      </w:r>
+      <w:r>
+        <w:rPr>
+          <w:rStyle w:val="IntenseQuoteChar"/>
+          <w:lang w:val="en-US"/>
+        </w:rPr>
+        <w:t>"</w:t>
+      </w:r>
+      <w:r>
+        <w:rPr>
+          <w:rStyle w:val="IntenseQuoteChar"/>
+          <w:lang w:val="en-US"/>
+        </w:rPr>
+        <w:br/>
+      </w:r>
+      <w:r>
+        <w:rPr>
+          <w:rStyle w:val="IntenseQuoteChar"/>
+          <w:lang w:val="en-US"/>
+        </w:rPr>
+        <w:t>New-ADGroup -Name "SG-$</w:t>
+      </w:r>
+      <w:r>
+        <w:rPr>
+          <w:rStyle w:val="IntenseQuoteChar"/>
+          <w:lang w:val="en-US"/>
+        </w:rPr>
+        <w:t>o</w:t>
+      </w:r>
+      <w:r>
+        <w:rPr>
+          <w:rStyle w:val="IntenseQuoteChar"/>
+          <w:lang w:val="en-US"/>
+        </w:rPr>
+        <w:t>" -GroupCategory Security -GroupScope Global -Path "OU=$</w:t>
+      </w:r>
+      <w:r>
+        <w:rPr>
+          <w:rStyle w:val="IntenseQuoteChar"/>
+          <w:lang w:val="en-US"/>
+        </w:rPr>
+        <w:t>o</w:t>
+      </w:r>
+      <w:r>
+        <w:rPr>
+          <w:rStyle w:val="IntenseQuoteChar"/>
+          <w:lang w:val="en-US"/>
+        </w:rPr>
+        <w:t xml:space="preserve">,DC=homelab,DC=local" -WhatIf </w:t>
+      </w:r>
+      <w:r>
+        <w:rPr>
+          <w:rStyle w:val="IntenseQuoteChar"/>
+          <w:lang w:val="en-US"/>
+        </w:rPr>
+        <w:br/>
+      </w:r>
+      <w:r>
+        <w:rPr>
+          <w:rStyle w:val="IntenseQuoteChar"/>
+          <w:lang w:val="en-US"/>
+        </w:rPr>
+        <w:lastRenderedPageBreak/>
+        <w:t>}</w:t>
+      </w:r>
+      <w:r>
+        <w:rPr>
+          <w:rStyle w:val="IntenseQuoteChar"/>
+          <w:lang w:val="en-US"/>
+        </w:rPr>
+        <w:t xml:space="preserve"> </w:t>
+      </w:r>
+      <w:r>
+        <w:rPr>
+          <w:rStyle w:val="IntenseQuoteChar"/>
+          <w:lang w:val="en-US"/>
+        </w:rPr>
+        <w:t>else {</w:t>
+      </w:r>
+      <w:r>
+        <w:rPr>
+          <w:rStyle w:val="IntenseQuoteChar"/>
+          <w:lang w:val="en-US"/>
+        </w:rPr>
+        <w:br/>
+      </w:r>
+      <w:r>
+        <w:rPr>
+          <w:rStyle w:val="IntenseQuoteChar"/>
+          <w:lang w:val="en-US"/>
+        </w:rPr>
+        <w:t>Write-Host "SG-$</w:t>
+      </w:r>
+      <w:r>
+        <w:rPr>
+          <w:rStyle w:val="IntenseQuoteChar"/>
+          <w:lang w:val="en-US"/>
+        </w:rPr>
+        <w:t>o</w:t>
+      </w:r>
+      <w:r>
+        <w:rPr>
+          <w:rStyle w:val="IntenseQuoteChar"/>
+          <w:lang w:val="en-US"/>
+        </w:rPr>
+        <w:t xml:space="preserve"> already exists, skipping</w:t>
+      </w:r>
+      <w:r>
+        <w:rPr>
+          <w:rStyle w:val="IntenseQuoteChar"/>
+          <w:lang w:val="en-US"/>
+        </w:rPr>
+        <w:t xml:space="preserve"> creation</w:t>
+      </w:r>
+      <w:r>
+        <w:rPr>
+          <w:rStyle w:val="IntenseQuoteChar"/>
+          <w:lang w:val="en-US"/>
+        </w:rPr>
+        <w:t>"</w:t>
+      </w:r>
+      <w:r>
+        <w:rPr>
+          <w:rStyle w:val="IntenseQuoteChar"/>
+          <w:lang w:val="en-US"/>
+        </w:rPr>
+        <w:br/>
+      </w:r>
+      <w:r>
+        <w:rPr>
+          <w:rStyle w:val="IntenseQuoteChar"/>
+          <w:lang w:val="en-US"/>
+        </w:rPr>
+        <w:t>}}</w:t>
+      </w:r>
+    </w:p>
+    <w:p>
+      <w:r>
+        <w:t>Kände mig klar för d</w:t>
+      </w:r>
+      <w:r>
+        <w:t xml:space="preserve">agen här, hade fått ordning på samtliga avdelningar och hade nu medlemmar i </w:t>
+      </w:r>
+      <w:r>
+        <w:t>varje</w:t>
+      </w:r>
+      <w:r>
+        <w:t xml:space="preserve"> avdelning också. Tog en WM-snapshot vid detta tillfälle för säkerhetsskull. Sparade även mitt script i en textfil, ifall jag kan behöva den i framtiden.</w:t>
+      </w:r>
+      <w:r>
+        <w:t xml:space="preserve"> Kanske gör en liknande loop för att skapa flera användare senare.</w:t>
+      </w:r>
+    </w:p>
+    <w:p>
+      <w:r>
+        <w:t xml:space="preserve"> </w:t>
+      </w:r>
     </w:p>
     <w:sectPr>
       <w:pgSz w:w="11906" w:h="16838"/>
@@ -4326,7 +4846,6 @@
   <w:style w:type="character" w:default="1" w:styleId="DefaultParagraphFont">
     <w:name w:val="Default Paragraph Font"/>
     <w:uiPriority w:val="1"/>
-    <w:semiHidden/>
     <w:unhideWhenUsed/>
   </w:style>
   <w:style w:type="table" w:default="1" w:styleId="TableNormal">

</xml_diff>